<commit_message>
answer interview order updates and answer instruction language edits
</commit_message>
<xml_diff>
--- a/docassemble/MLHDivorceAndCustody/data/templates/instructions_divorce_answer.docx
+++ b/docassemble/MLHDivorceAndCustody/data/templates/instructions_divorce_answer.docx
@@ -1,6 +1,6 @@
 
 <file path=word/document.xml><?xml version="1.0" encoding="utf-8"?>
-<w:document xmlns:wpc="http://schemas.microsoft.com/office/word/2010/wordprocessingCanvas" xmlns:cx="http://schemas.microsoft.com/office/drawing/2014/chartex" xmlns:cx1="http://schemas.microsoft.com/office/drawing/2015/9/8/chartex" xmlns:cx2="http://schemas.microsoft.com/office/drawing/2015/10/21/chartex" xmlns:cx3="http://schemas.microsoft.com/office/drawing/2016/5/9/chartex" xmlns:cx4="http://schemas.microsoft.com/office/drawing/2016/5/10/chartex" xmlns:cx5="http://schemas.microsoft.com/office/drawing/2016/5/11/chartex" xmlns:cx6="http://schemas.microsoft.com/office/drawing/2016/5/12/chartex" xmlns:cx7="http://schemas.microsoft.com/office/drawing/2016/5/13/chartex" xmlns:cx8="http://schemas.microsoft.com/office/drawing/2016/5/14/chartex" xmlns:mc="http://schemas.openxmlformats.org/markup-compatibility/2006" xmlns:aink="http://schemas.microsoft.com/office/drawing/2016/ink" xmlns:am3d="http://schemas.microsoft.com/office/drawing/2017/model3d" xmlns:o="urn:schemas-microsoft-com:office:office" xmlns:oel="http://schemas.microsoft.com/office/2019/extlst" xmlns:r="http://schemas.openxmlformats.org/officeDocument/2006/relationships" xmlns:m="http://schemas.openxmlformats.org/officeDocument/2006/math" xmlns:v="urn:schemas-microsoft-com:vml" xmlns:wp14="http://schemas.microsoft.com/office/word/2010/wordprocessingDrawing" xmlns:wp="http://schemas.openxmlformats.org/drawingml/2006/wordprocessingDrawing" xmlns:w10="urn:schemas-microsoft-com:office:word" xmlns:w="http://schemas.openxmlformats.org/wordprocessingml/2006/main" xmlns:w14="http://schemas.microsoft.com/office/word/2010/wordml" xmlns:w15="http://schemas.microsoft.com/office/word/2012/wordml" xmlns:w16cex="http://schemas.microsoft.com/office/word/2018/wordml/cex" xmlns:w16cid="http://schemas.microsoft.com/office/word/2016/wordml/cid" xmlns:w16="http://schemas.microsoft.com/office/word/2018/wordml" xmlns:w16du="http://schemas.microsoft.com/office/word/2023/wordml/word16du" xmlns:w16sdtdh="http://schemas.microsoft.com/office/word/2020/wordml/sdtdatahash" xmlns:w16sdtfl="http://schemas.microsoft.com/office/word/2024/wordml/sdtformatlock" xmlns:w16se="http://schemas.microsoft.com/office/word/2015/wordml/symex" xmlns:wpg="http://schemas.microsoft.com/office/word/2010/wordprocessingGroup" xmlns:wpi="http://schemas.microsoft.com/office/word/2010/wordprocessingInk" xmlns:wne="http://schemas.microsoft.com/office/word/2006/wordml" xmlns:wps="http://schemas.microsoft.com/office/word/2010/wordprocessingShape" mc:Ignorable="w14 w15 w16se w16cid w16 w16cex w16sdtdh w16sdtfl w16du wp14">
+<w:document xmlns:wpc="http://schemas.microsoft.com/office/word/2010/wordprocessingCanvas" xmlns:cx="http://schemas.microsoft.com/office/drawing/2014/chartex" xmlns:cx1="http://schemas.microsoft.com/office/drawing/2015/9/8/chartex" xmlns:cx2="http://schemas.microsoft.com/office/drawing/2015/10/21/chartex" xmlns:cx3="http://schemas.microsoft.com/office/drawing/2016/5/9/chartex" xmlns:cx4="http://schemas.microsoft.com/office/drawing/2016/5/10/chartex" xmlns:cx5="http://schemas.microsoft.com/office/drawing/2016/5/11/chartex" xmlns:cx6="http://schemas.microsoft.com/office/drawing/2016/5/12/chartex" xmlns:cx7="http://schemas.microsoft.com/office/drawing/2016/5/13/chartex" xmlns:cx8="http://schemas.microsoft.com/office/drawing/2016/5/14/chartex" xmlns:mc="http://schemas.openxmlformats.org/markup-compatibility/2006" xmlns:m="http://schemas.openxmlformats.org/officeDocument/2006/math" xmlns:aink="http://schemas.microsoft.com/office/drawing/2016/ink" xmlns:am3d="http://schemas.microsoft.com/office/drawing/2017/model3d" xmlns:oel="http://schemas.microsoft.com/office/2019/extlst" xmlns:r="http://schemas.openxmlformats.org/officeDocument/2006/relationships" xmlns:wp14="http://schemas.microsoft.com/office/word/2010/wordprocessingDrawing" xmlns:wp="http://schemas.openxmlformats.org/drawingml/2006/wordprocessingDrawing" xmlns:wpg="http://schemas.microsoft.com/office/word/2010/wordprocessingGroup" xmlns:wpi="http://schemas.microsoft.com/office/word/2010/wordprocessingInk" xmlns:wps="http://schemas.microsoft.com/office/word/2010/wordprocessingShape" xmlns:o="urn:schemas-microsoft-com:office:office" xmlns:v="urn:schemas-microsoft-com:vml" xmlns:w10="urn:schemas-microsoft-com:office:word" xmlns:w="http://schemas.openxmlformats.org/wordprocessingml/2006/main" xmlns:w14="http://schemas.microsoft.com/office/word/2010/wordml" xmlns:w15="http://schemas.microsoft.com/office/word/2012/wordml" xmlns:w16cei="http://schemas.microsoft.com/office/word/2026/wordml/cei" xmlns:w16cex="http://schemas.microsoft.com/office/word/2018/wordml/cex" xmlns:w16cid="http://schemas.microsoft.com/office/word/2016/wordml/cid" xmlns:w16="http://schemas.microsoft.com/office/word/2018/wordml" xmlns:w16sdtdh="http://schemas.microsoft.com/office/word/2020/wordml/sdtdatahash" xmlns:w16sdtfl="http://schemas.microsoft.com/office/word/2024/wordml/sdtformatlock" xmlns:w16se="http://schemas.microsoft.com/office/word/2015/wordml/symex" xmlns:w16du="http://schemas.microsoft.com/office/word/2023/wordml/word16du" xmlns:wne="http://schemas.microsoft.com/office/word/2006/wordml" mc:Ignorable="w14 w15 w16se w16cid w16 w16cex w16sdtdh w16sdtfl w16du wp14">
   <w:body>
     <w:p>
       <w:pPr>
@@ -13,16 +13,96 @@
         <w:t xml:space="preserve"> Answer and Counterclaim to a Complaint for Divorce </w:t>
       </w:r>
       <w:r>
-        <w:t>{% if (not create_counterclaim and there_are_marital_children) or (create_counterclaim and counterclaim_type == “with_children”) %}</w:t>
-      </w:r>
-      <w:r>
-        <w:t xml:space="preserve">with{% else %}without{% endif %} </w:t>
+        <w:t xml:space="preserve">{% if (not </w:t>
+      </w:r>
+      <w:proofErr w:type="spellStart"/>
+      <w:r>
+        <w:t>create_counterclaim</w:t>
+      </w:r>
+      <w:proofErr w:type="spellEnd"/>
+      <w:r>
+        <w:t xml:space="preserve"> and </w:t>
+      </w:r>
+      <w:proofErr w:type="spellStart"/>
+      <w:r>
+        <w:t>there_are_marital_children</w:t>
+      </w:r>
+      <w:proofErr w:type="spellEnd"/>
+      <w:r>
+        <w:t>) or (</w:t>
+      </w:r>
+      <w:proofErr w:type="spellStart"/>
+      <w:r>
+        <w:t>create_counterclaim</w:t>
+      </w:r>
+      <w:proofErr w:type="spellEnd"/>
+      <w:r>
+        <w:t xml:space="preserve"> and </w:t>
+      </w:r>
+      <w:proofErr w:type="spellStart"/>
+      <w:r>
+        <w:t>counterclaim_type</w:t>
+      </w:r>
+      <w:proofErr w:type="spellEnd"/>
+      <w:r>
+        <w:t xml:space="preserve"> == “</w:t>
+      </w:r>
+      <w:proofErr w:type="spellStart"/>
+      <w:r>
+        <w:t>with_children</w:t>
+      </w:r>
+      <w:proofErr w:type="spellEnd"/>
+      <w:r>
+        <w:t xml:space="preserve">”) </w:t>
+      </w:r>
+      <w:proofErr w:type="gramStart"/>
+      <w:r>
+        <w:t>%}</w:t>
+      </w:r>
+      <w:r>
+        <w:t>with</w:t>
+      </w:r>
+      <w:proofErr w:type="gramEnd"/>
+      <w:r>
+        <w:t xml:space="preserve">{% else </w:t>
+      </w:r>
+      <w:proofErr w:type="gramStart"/>
+      <w:r>
+        <w:t>%}without</w:t>
+      </w:r>
+      <w:proofErr w:type="gramEnd"/>
+      <w:r>
+        <w:t xml:space="preserve">{% endif %} </w:t>
       </w:r>
       <w:r>
         <w:t>Children</w:t>
       </w:r>
       <w:r>
-        <w:t xml:space="preserve"> {% if county_choice == “Oakland” %}(Oakland County){% endif %}</w:t>
+        <w:t xml:space="preserve"> {% if </w:t>
+      </w:r>
+      <w:proofErr w:type="spellStart"/>
+      <w:r>
+        <w:t>county_choice</w:t>
+      </w:r>
+      <w:proofErr w:type="spellEnd"/>
+      <w:r>
+        <w:t xml:space="preserve"> == “Oakland” </w:t>
+      </w:r>
+      <w:proofErr w:type="gramStart"/>
+      <w:r>
+        <w:t>%}(</w:t>
+      </w:r>
+      <w:proofErr w:type="gramEnd"/>
+      <w:r>
+        <w:t xml:space="preserve">Oakland </w:t>
+      </w:r>
+      <w:proofErr w:type="gramStart"/>
+      <w:r>
+        <w:t>County){</w:t>
+      </w:r>
+      <w:proofErr w:type="gramEnd"/>
+      <w:r>
+        <w:t>% endif %}</w:t>
       </w:r>
     </w:p>
     <w:p>
@@ -60,7 +140,97 @@
           <w:bCs/>
           <w:color w:val="222222"/>
         </w:rPr>
-        <w:t>if (not create_counterclaim and there_are_marital_children) or (create_counterclaim and counterclaim_type == “with_children”)</w:t>
+        <w:t xml:space="preserve">if (not </w:t>
+      </w:r>
+      <w:proofErr w:type="spellStart"/>
+      <w:r>
+        <w:rPr>
+          <w:b/>
+          <w:bCs/>
+          <w:color w:val="222222"/>
+        </w:rPr>
+        <w:t>create_counterclaim</w:t>
+      </w:r>
+      <w:proofErr w:type="spellEnd"/>
+      <w:r>
+        <w:rPr>
+          <w:b/>
+          <w:bCs/>
+          <w:color w:val="222222"/>
+        </w:rPr>
+        <w:t xml:space="preserve"> and </w:t>
+      </w:r>
+      <w:proofErr w:type="spellStart"/>
+      <w:r>
+        <w:rPr>
+          <w:b/>
+          <w:bCs/>
+          <w:color w:val="222222"/>
+        </w:rPr>
+        <w:t>there_are_marital_children</w:t>
+      </w:r>
+      <w:proofErr w:type="spellEnd"/>
+      <w:r>
+        <w:rPr>
+          <w:b/>
+          <w:bCs/>
+          <w:color w:val="222222"/>
+        </w:rPr>
+        <w:t>) or (</w:t>
+      </w:r>
+      <w:proofErr w:type="spellStart"/>
+      <w:r>
+        <w:rPr>
+          <w:b/>
+          <w:bCs/>
+          <w:color w:val="222222"/>
+        </w:rPr>
+        <w:t>create_counterclaim</w:t>
+      </w:r>
+      <w:proofErr w:type="spellEnd"/>
+      <w:r>
+        <w:rPr>
+          <w:b/>
+          <w:bCs/>
+          <w:color w:val="222222"/>
+        </w:rPr>
+        <w:t xml:space="preserve"> and </w:t>
+      </w:r>
+      <w:proofErr w:type="spellStart"/>
+      <w:r>
+        <w:rPr>
+          <w:b/>
+          <w:bCs/>
+          <w:color w:val="222222"/>
+        </w:rPr>
+        <w:t>counterclaim_type</w:t>
+      </w:r>
+      <w:proofErr w:type="spellEnd"/>
+      <w:r>
+        <w:rPr>
+          <w:b/>
+          <w:bCs/>
+          <w:color w:val="222222"/>
+        </w:rPr>
+        <w:t xml:space="preserve"> == “</w:t>
+      </w:r>
+      <w:proofErr w:type="spellStart"/>
+      <w:r>
+        <w:rPr>
+          <w:b/>
+          <w:bCs/>
+          <w:color w:val="222222"/>
+        </w:rPr>
+        <w:t>with_children</w:t>
+      </w:r>
+      <w:proofErr w:type="spellEnd"/>
+      <w:r>
+        <w:rPr>
+          <w:b/>
+          <w:bCs/>
+          <w:color w:val="222222"/>
+        </w:rPr>
+        <w:t>”)</w:t>
       </w:r>
       <w:r>
         <w:rPr>
@@ -229,7 +399,28 @@
         <w:rPr>
           <w:color w:val="222222"/>
         </w:rPr>
-        <w:t xml:space="preserve">if county_choice </w:t>
+        <w:t xml:space="preserve">if </w:t>
+      </w:r>
+      <w:proofErr w:type="spellStart"/>
+      <w:r>
+        <w:rPr>
+          <w:color w:val="222222"/>
+        </w:rPr>
+        <w:t>county_</w:t>
+      </w:r>
+      <w:proofErr w:type="gramStart"/>
+      <w:r>
+        <w:rPr>
+          <w:color w:val="222222"/>
+        </w:rPr>
+        <w:t>choice</w:t>
+      </w:r>
+      <w:proofErr w:type="spellEnd"/>
+      <w:r>
+        <w:rPr>
+          <w:color w:val="222222"/>
+        </w:rPr>
+        <w:t xml:space="preserve"> </w:t>
       </w:r>
       <w:r>
         <w:rPr>
@@ -237,6 +428,7 @@
         </w:rPr>
         <w:t>!</w:t>
       </w:r>
+      <w:proofErr w:type="gramEnd"/>
       <w:r>
         <w:rPr>
           <w:color w:val="222222"/>
@@ -342,13 +534,55 @@
         <w:rPr>
           <w:color w:val="222222"/>
         </w:rPr>
-        <w:t>You will not file all of these forms at the beginning of your case; some you will use later.</w:t>
-      </w:r>
-      <w:r>
-        <w:rPr>
-          <w:color w:val="222222"/>
-        </w:rPr>
-        <w:t xml:space="preserve">{% if county_choice </w:t>
+        <w:t xml:space="preserve">You will not file </w:t>
+      </w:r>
+      <w:proofErr w:type="gramStart"/>
+      <w:r>
+        <w:rPr>
+          <w:color w:val="222222"/>
+        </w:rPr>
+        <w:t>all of</w:t>
+      </w:r>
+      <w:proofErr w:type="gramEnd"/>
+      <w:r>
+        <w:rPr>
+          <w:color w:val="222222"/>
+        </w:rPr>
+        <w:t xml:space="preserve"> these forms at the beginning of your case; some you will use </w:t>
+      </w:r>
+      <w:proofErr w:type="gramStart"/>
+      <w:r>
+        <w:rPr>
+          <w:color w:val="222222"/>
+        </w:rPr>
+        <w:t>later.</w:t>
+      </w:r>
+      <w:r>
+        <w:rPr>
+          <w:color w:val="222222"/>
+        </w:rPr>
+        <w:t>{</w:t>
+      </w:r>
+      <w:proofErr w:type="gramEnd"/>
+      <w:r>
+        <w:rPr>
+          <w:color w:val="222222"/>
+        </w:rPr>
+        <w:t xml:space="preserve">% if </w:t>
+      </w:r>
+      <w:proofErr w:type="spellStart"/>
+      <w:r>
+        <w:rPr>
+          <w:color w:val="222222"/>
+        </w:rPr>
+        <w:t>county_choice</w:t>
+      </w:r>
+      <w:proofErr w:type="spellEnd"/>
+      <w:r>
+        <w:rPr>
+          <w:color w:val="222222"/>
+        </w:rPr>
+        <w:t xml:space="preserve"> </w:t>
       </w:r>
       <w:r>
         <w:rPr>
@@ -381,13 +615,27 @@
         <w:rPr>
           <w:color w:val="222222"/>
         </w:rPr>
-        <w:t>You will need to make copies of some of the forms. The instructions below explain which forms you need for each step and how many copies to make.</w:t>
-      </w:r>
-      <w:r>
-        <w:rPr>
-          <w:color w:val="222222"/>
-        </w:rPr>
-        <w:t>{% endif %}</w:t>
+        <w:t xml:space="preserve">You will need to make copies of some of the forms. The instructions below explain which forms you need for each step and how many copies to </w:t>
+      </w:r>
+      <w:proofErr w:type="gramStart"/>
+      <w:r>
+        <w:rPr>
+          <w:color w:val="222222"/>
+        </w:rPr>
+        <w:t>make.</w:t>
+      </w:r>
+      <w:r>
+        <w:rPr>
+          <w:color w:val="222222"/>
+        </w:rPr>
+        <w:t>{</w:t>
+      </w:r>
+      <w:proofErr w:type="gramEnd"/>
+      <w:r>
+        <w:rPr>
+          <w:color w:val="222222"/>
+        </w:rPr>
+        <w:t>% endif %}</w:t>
       </w:r>
     </w:p>
     <w:p>
@@ -403,11 +651,19 @@
         </w:rPr>
         <w:t xml:space="preserve">{%p if </w:t>
       </w:r>
-      <w:r>
-        <w:rPr>
-          <w:color w:val="222222"/>
-        </w:rPr>
-        <w:t xml:space="preserve">county_choice </w:t>
+      <w:proofErr w:type="spellStart"/>
+      <w:r>
+        <w:rPr>
+          <w:color w:val="222222"/>
+        </w:rPr>
+        <w:t>county_choice</w:t>
+      </w:r>
+      <w:proofErr w:type="spellEnd"/>
+      <w:r>
+        <w:rPr>
+          <w:color w:val="222222"/>
+        </w:rPr>
+        <w:t xml:space="preserve"> </w:t>
       </w:r>
       <w:r>
         <w:rPr>
@@ -436,11 +692,19 @@
         <w:t xml:space="preserve">In Oakland County, you will e-file your forms on the </w:t>
       </w:r>
       <w:hyperlink r:id="rId8" w:history="1">
+        <w:proofErr w:type="spellStart"/>
         <w:r>
           <w:rPr>
             <w:rStyle w:val="Hyperlink"/>
           </w:rPr>
-          <w:t>MiFILE website</w:t>
+          <w:t>MiFILE</w:t>
+        </w:r>
+        <w:proofErr w:type="spellEnd"/>
+        <w:r>
+          <w:rPr>
+            <w:rStyle w:val="Hyperlink"/>
+          </w:rPr>
+          <w:t xml:space="preserve"> website</w:t>
         </w:r>
       </w:hyperlink>
       <w:r>
@@ -534,8 +798,17 @@
           <w:color w:val="222222"/>
           <w:highlight w:val="white"/>
         </w:rPr>
-        <w:t>E-filing using MiFILE</w:t>
-      </w:r>
+        <w:t xml:space="preserve">E-filing using </w:t>
+      </w:r>
+      <w:proofErr w:type="spellStart"/>
+      <w:r>
+        <w:rPr>
+          <w:color w:val="222222"/>
+          <w:highlight w:val="white"/>
+        </w:rPr>
+        <w:t>MiFILE</w:t>
+      </w:r>
+      <w:proofErr w:type="spellEnd"/>
     </w:p>
     <w:p>
       <w:pPr>
@@ -597,6 +870,7 @@
         </w:rPr>
       </w:pPr>
       <w:hyperlink r:id="rId10">
+        <w:proofErr w:type="spellStart"/>
         <w:r>
           <w:rPr>
             <w:color w:val="1155CC"/>
@@ -605,6 +879,7 @@
           </w:rPr>
           <w:t>MiFILE</w:t>
         </w:r>
+        <w:proofErr w:type="spellEnd"/>
       </w:hyperlink>
       <w:r>
         <w:rPr>
@@ -927,7 +1202,21 @@
         <w:rPr>
           <w:color w:val="222222"/>
         </w:rPr>
-        <w:t xml:space="preserve">not create_counterclaim </w:t>
+        <w:t xml:space="preserve">not </w:t>
+      </w:r>
+      <w:proofErr w:type="spellStart"/>
+      <w:r>
+        <w:rPr>
+          <w:color w:val="222222"/>
+        </w:rPr>
+        <w:t>create_counterclaim</w:t>
+      </w:r>
+      <w:proofErr w:type="spellEnd"/>
+      <w:r>
+        <w:rPr>
+          <w:color w:val="222222"/>
+        </w:rPr>
+        <w:t xml:space="preserve"> </w:t>
       </w:r>
       <w:r>
         <w:rPr>
@@ -939,19 +1228,63 @@
         <w:rPr>
           <w:color w:val="222222"/>
         </w:rPr>
-        <w:t xml:space="preserve"> there_are_marital_children</w:t>
-      </w:r>
-      <w:r>
-        <w:rPr>
-          <w:color w:val="222222"/>
-        </w:rPr>
-        <w:t xml:space="preserve">) or (create_counterclaim and </w:t>
-      </w:r>
-      <w:r>
-        <w:rPr>
-          <w:color w:val="222222"/>
-        </w:rPr>
-        <w:t>counterclaim_type == “with_children”</w:t>
+        <w:t xml:space="preserve"> </w:t>
+      </w:r>
+      <w:proofErr w:type="spellStart"/>
+      <w:r>
+        <w:rPr>
+          <w:color w:val="222222"/>
+        </w:rPr>
+        <w:t>there_are_marital_children</w:t>
+      </w:r>
+      <w:proofErr w:type="spellEnd"/>
+      <w:r>
+        <w:rPr>
+          <w:color w:val="222222"/>
+        </w:rPr>
+        <w:t>) or (</w:t>
+      </w:r>
+      <w:proofErr w:type="spellStart"/>
+      <w:r>
+        <w:rPr>
+          <w:color w:val="222222"/>
+        </w:rPr>
+        <w:t>create_counterclaim</w:t>
+      </w:r>
+      <w:proofErr w:type="spellEnd"/>
+      <w:r>
+        <w:rPr>
+          <w:color w:val="222222"/>
+        </w:rPr>
+        <w:t xml:space="preserve"> and </w:t>
+      </w:r>
+      <w:proofErr w:type="spellStart"/>
+      <w:r>
+        <w:rPr>
+          <w:color w:val="222222"/>
+        </w:rPr>
+        <w:t>counterclaim_type</w:t>
+      </w:r>
+      <w:proofErr w:type="spellEnd"/>
+      <w:r>
+        <w:rPr>
+          <w:color w:val="222222"/>
+        </w:rPr>
+        <w:t xml:space="preserve"> == “</w:t>
+      </w:r>
+      <w:proofErr w:type="spellStart"/>
+      <w:r>
+        <w:rPr>
+          <w:color w:val="222222"/>
+        </w:rPr>
+        <w:t>with_children</w:t>
+      </w:r>
+      <w:proofErr w:type="spellEnd"/>
+      <w:r>
+        <w:rPr>
+          <w:color w:val="222222"/>
+        </w:rPr>
+        <w:t>”</w:t>
       </w:r>
       <w:r>
         <w:rPr>
@@ -1063,7 +1396,35 @@
         <w:rPr>
           <w:color w:val="222222"/>
         </w:rPr>
-        <w:t xml:space="preserve"> If the plaintiff served you with copies of these forms, that likely means they have filed them. You can also check with the court clerk’s office to see if the forms were filed, or check MiFILE if your case was e-filed.</w:t>
+        <w:t xml:space="preserve"> If the plaintiff served you with copies of these forms, that likely means they have filed them. You can also check with the court clerk’s office to see if the forms were </w:t>
+      </w:r>
+      <w:proofErr w:type="gramStart"/>
+      <w:r>
+        <w:rPr>
+          <w:color w:val="222222"/>
+        </w:rPr>
+        <w:t>filed, or</w:t>
+      </w:r>
+      <w:proofErr w:type="gramEnd"/>
+      <w:r>
+        <w:rPr>
+          <w:color w:val="222222"/>
+        </w:rPr>
+        <w:t xml:space="preserve"> check </w:t>
+      </w:r>
+      <w:proofErr w:type="spellStart"/>
+      <w:r>
+        <w:rPr>
+          <w:color w:val="222222"/>
+        </w:rPr>
+        <w:t>MiFILE</w:t>
+      </w:r>
+      <w:proofErr w:type="spellEnd"/>
+      <w:r>
+        <w:rPr>
+          <w:color w:val="222222"/>
+        </w:rPr>
+        <w:t xml:space="preserve"> if your case was e-filed.</w:t>
       </w:r>
     </w:p>
     <w:p>
@@ -1078,7 +1439,21 @@
           <w:color w:val="222222"/>
         </w:rPr>
         <w:lastRenderedPageBreak/>
-        <w:t xml:space="preserve">If you find that the plaintiff did not file these forms, sign the Application for IV-D Child Support Services and the Verified Statement created by the form tool. The Uniform Child Custody Jurisdiction Enforcement Act Affidavit has to be signed in front of a notary. There may be a fee for notarization. You may be able to get your document notarized at a bank or at the court clerk's office. Some copy and print shops also offer notary services for a fee. Contact the bank or other location to make sure that a notary will be available at the time you plan on going. </w:t>
+        <w:t xml:space="preserve">If you find that the plaintiff did not file these forms, sign the Application for IV-D Child Support Services and the Verified Statement created by the form tool. The Uniform Child Custody Jurisdiction Enforcement Act Affidavit </w:t>
+      </w:r>
+      <w:proofErr w:type="gramStart"/>
+      <w:r>
+        <w:rPr>
+          <w:color w:val="222222"/>
+        </w:rPr>
+        <w:t>has to</w:t>
+      </w:r>
+      <w:proofErr w:type="gramEnd"/>
+      <w:r>
+        <w:rPr>
+          <w:color w:val="222222"/>
+        </w:rPr>
+        <w:t xml:space="preserve"> be signed in front of a notary. There may be a fee for notarization. You may be able to get your document notarized at a bank or at the court clerk's office. Some copy and print shops also offer notary services for a fee. Contact the bank or other location to make sure that a notary will be available at the time you plan on going. </w:t>
       </w:r>
     </w:p>
     <w:p>
@@ -1135,11 +1510,19 @@
         </w:rPr>
         <w:t xml:space="preserve">{%p if </w:t>
       </w:r>
-      <w:r>
-        <w:rPr>
-          <w:color w:val="222222"/>
-        </w:rPr>
-        <w:t xml:space="preserve">county_choice </w:t>
+      <w:proofErr w:type="spellStart"/>
+      <w:r>
+        <w:rPr>
+          <w:color w:val="222222"/>
+        </w:rPr>
+        <w:t>county_choice</w:t>
+      </w:r>
+      <w:proofErr w:type="spellEnd"/>
+      <w:r>
+        <w:rPr>
+          <w:color w:val="222222"/>
+        </w:rPr>
+        <w:t xml:space="preserve"> </w:t>
       </w:r>
       <w:r>
         <w:rPr>
@@ -1200,7 +1583,25 @@
           <w:bCs/>
           <w:color w:val="222222"/>
         </w:rPr>
-        <w:t xml:space="preserve">{% if (not create_counterclaim and </w:t>
+        <w:t xml:space="preserve">{% if (not </w:t>
+      </w:r>
+      <w:proofErr w:type="spellStart"/>
+      <w:r>
+        <w:rPr>
+          <w:b/>
+          <w:bCs/>
+          <w:color w:val="222222"/>
+        </w:rPr>
+        <w:t>create_counterclaim</w:t>
+      </w:r>
+      <w:proofErr w:type="spellEnd"/>
+      <w:r>
+        <w:rPr>
+          <w:b/>
+          <w:bCs/>
+          <w:color w:val="222222"/>
+        </w:rPr>
+        <w:t xml:space="preserve"> and </w:t>
       </w:r>
       <w:r>
         <w:rPr>
@@ -1210,14 +1611,61 @@
         </w:rPr>
         <w:t xml:space="preserve">not </w:t>
       </w:r>
-      <w:r>
-        <w:rPr>
-          <w:b/>
-          <w:bCs/>
-          <w:color w:val="222222"/>
-        </w:rPr>
-        <w:t>there_are_marital_children) or (create_counterclaim and counterclaim_type == “</w:t>
-      </w:r>
+      <w:proofErr w:type="spellStart"/>
+      <w:r>
+        <w:rPr>
+          <w:b/>
+          <w:bCs/>
+          <w:color w:val="222222"/>
+        </w:rPr>
+        <w:t>there_are_marital_children</w:t>
+      </w:r>
+      <w:proofErr w:type="spellEnd"/>
+      <w:r>
+        <w:rPr>
+          <w:b/>
+          <w:bCs/>
+          <w:color w:val="222222"/>
+        </w:rPr>
+        <w:t>) or (</w:t>
+      </w:r>
+      <w:proofErr w:type="spellStart"/>
+      <w:r>
+        <w:rPr>
+          <w:b/>
+          <w:bCs/>
+          <w:color w:val="222222"/>
+        </w:rPr>
+        <w:t>create_counterclaim</w:t>
+      </w:r>
+      <w:proofErr w:type="spellEnd"/>
+      <w:r>
+        <w:rPr>
+          <w:b/>
+          <w:bCs/>
+          <w:color w:val="222222"/>
+        </w:rPr>
+        <w:t xml:space="preserve"> and </w:t>
+      </w:r>
+      <w:proofErr w:type="spellStart"/>
+      <w:r>
+        <w:rPr>
+          <w:b/>
+          <w:bCs/>
+          <w:color w:val="222222"/>
+        </w:rPr>
+        <w:t>counterclaim_type</w:t>
+      </w:r>
+      <w:proofErr w:type="spellEnd"/>
+      <w:r>
+        <w:rPr>
+          <w:b/>
+          <w:bCs/>
+          <w:color w:val="222222"/>
+        </w:rPr>
+        <w:t xml:space="preserve"> == “</w:t>
+      </w:r>
+      <w:proofErr w:type="spellStart"/>
       <w:r>
         <w:rPr>
           <w:b/>
@@ -1232,7 +1680,16 @@
           <w:bCs/>
           <w:color w:val="222222"/>
         </w:rPr>
-        <w:t>_children”) %}</w:t>
+        <w:t>_children</w:t>
+      </w:r>
+      <w:proofErr w:type="spellEnd"/>
+      <w:r>
+        <w:rPr>
+          <w:b/>
+          <w:bCs/>
+          <w:color w:val="222222"/>
+        </w:rPr>
+        <w:t>”) %}</w:t>
       </w:r>
       <w:r>
         <w:rPr>
@@ -1258,13 +1715,23 @@
         </w:rPr>
         <w:t xml:space="preserve"> else %}F{% endif %}</w:t>
       </w:r>
-      <w:r>
-        <w:rPr>
-          <w:b/>
-          <w:bCs/>
-          <w:color w:val="222222"/>
-        </w:rPr>
-        <w:t>ind out if you need Friend of the Court copies.</w:t>
+      <w:proofErr w:type="spellStart"/>
+      <w:r>
+        <w:rPr>
+          <w:b/>
+          <w:bCs/>
+          <w:color w:val="222222"/>
+        </w:rPr>
+        <w:t>ind</w:t>
+      </w:r>
+      <w:proofErr w:type="spellEnd"/>
+      <w:r>
+        <w:rPr>
+          <w:b/>
+          <w:bCs/>
+          <w:color w:val="222222"/>
+        </w:rPr>
+        <w:t xml:space="preserve"> out if you need Friend of the Court copies.</w:t>
       </w:r>
       <w:r>
         <w:rPr>
@@ -1342,7 +1809,77 @@
         <w:rPr>
           <w:color w:val="222222"/>
         </w:rPr>
-        <w:t>(not create_counterclaim and not there_are_marital_children) or (create_counterclaim and counterclaim_type == “no_children”) %}</w:t>
+        <w:t xml:space="preserve">(not </w:t>
+      </w:r>
+      <w:proofErr w:type="spellStart"/>
+      <w:r>
+        <w:rPr>
+          <w:color w:val="222222"/>
+        </w:rPr>
+        <w:t>create_counterclaim</w:t>
+      </w:r>
+      <w:proofErr w:type="spellEnd"/>
+      <w:r>
+        <w:rPr>
+          <w:color w:val="222222"/>
+        </w:rPr>
+        <w:t xml:space="preserve"> and not </w:t>
+      </w:r>
+      <w:proofErr w:type="spellStart"/>
+      <w:r>
+        <w:rPr>
+          <w:color w:val="222222"/>
+        </w:rPr>
+        <w:t>there_are_marital_children</w:t>
+      </w:r>
+      <w:proofErr w:type="spellEnd"/>
+      <w:r>
+        <w:rPr>
+          <w:color w:val="222222"/>
+        </w:rPr>
+        <w:t>) or (</w:t>
+      </w:r>
+      <w:proofErr w:type="spellStart"/>
+      <w:r>
+        <w:rPr>
+          <w:color w:val="222222"/>
+        </w:rPr>
+        <w:t>create_counterclaim</w:t>
+      </w:r>
+      <w:proofErr w:type="spellEnd"/>
+      <w:r>
+        <w:rPr>
+          <w:color w:val="222222"/>
+        </w:rPr>
+        <w:t xml:space="preserve"> and </w:t>
+      </w:r>
+      <w:proofErr w:type="spellStart"/>
+      <w:r>
+        <w:rPr>
+          <w:color w:val="222222"/>
+        </w:rPr>
+        <w:t>counterclaim_type</w:t>
+      </w:r>
+      <w:proofErr w:type="spellEnd"/>
+      <w:r>
+        <w:rPr>
+          <w:color w:val="222222"/>
+        </w:rPr>
+        <w:t xml:space="preserve"> == “</w:t>
+      </w:r>
+      <w:proofErr w:type="spellStart"/>
+      <w:r>
+        <w:rPr>
+          <w:color w:val="222222"/>
+        </w:rPr>
+        <w:t>no_children</w:t>
+      </w:r>
+      <w:proofErr w:type="spellEnd"/>
+      <w:r>
+        <w:rPr>
+          <w:color w:val="222222"/>
+        </w:rPr>
+        <w:t>”) %}</w:t>
       </w:r>
     </w:p>
     <w:p>
@@ -1651,7 +2188,21 @@
         <w:rPr>
           <w:color w:val="222222"/>
         </w:rPr>
-        <w:t>{%p if county_choice == “Oakland” %}</w:t>
+        <w:t xml:space="preserve">{%p if </w:t>
+      </w:r>
+      <w:proofErr w:type="spellStart"/>
+      <w:r>
+        <w:rPr>
+          <w:color w:val="222222"/>
+        </w:rPr>
+        <w:t>county_choice</w:t>
+      </w:r>
+      <w:proofErr w:type="spellEnd"/>
+      <w:r>
+        <w:rPr>
+          <w:color w:val="222222"/>
+        </w:rPr>
+        <w:t xml:space="preserve"> == “Oakland” %}</w:t>
       </w:r>
     </w:p>
     <w:p>
@@ -1706,6 +2257,7 @@
         <w:t xml:space="preserve">Upload your documents in </w:t>
       </w:r>
       <w:hyperlink r:id="rId14">
+        <w:proofErr w:type="spellStart"/>
         <w:r>
           <w:rPr>
             <w:b/>
@@ -1715,6 +2267,7 @@
           </w:rPr>
           <w:t>MiFILE</w:t>
         </w:r>
+        <w:proofErr w:type="spellEnd"/>
       </w:hyperlink>
       <w:r>
         <w:rPr>
@@ -1722,7 +2275,43 @@
           <w:color w:val="222222"/>
           <w:highlight w:val="white"/>
         </w:rPr>
-        <w:t xml:space="preserve">. Within MiFILE, you will need to choose a drop down label for each individual document you upload. </w:t>
+        <w:t xml:space="preserve">. Within </w:t>
+      </w:r>
+      <w:proofErr w:type="spellStart"/>
+      <w:r>
+        <w:rPr>
+          <w:b/>
+          <w:color w:val="222222"/>
+          <w:highlight w:val="white"/>
+        </w:rPr>
+        <w:t>MiFILE</w:t>
+      </w:r>
+      <w:proofErr w:type="spellEnd"/>
+      <w:r>
+        <w:rPr>
+          <w:b/>
+          <w:color w:val="222222"/>
+          <w:highlight w:val="white"/>
+        </w:rPr>
+        <w:t xml:space="preserve">, you will need to choose a </w:t>
+      </w:r>
+      <w:proofErr w:type="gramStart"/>
+      <w:r>
+        <w:rPr>
+          <w:b/>
+          <w:color w:val="222222"/>
+          <w:highlight w:val="white"/>
+        </w:rPr>
+        <w:t>drop down</w:t>
+      </w:r>
+      <w:proofErr w:type="gramEnd"/>
+      <w:r>
+        <w:rPr>
+          <w:b/>
+          <w:color w:val="222222"/>
+          <w:highlight w:val="white"/>
+        </w:rPr>
+        <w:t xml:space="preserve"> label for each individual document you upload. </w:t>
       </w:r>
     </w:p>
     <w:p>
@@ -1772,7 +2361,77 @@
         <w:rPr>
           <w:color w:val="1B1B1B"/>
         </w:rPr>
-        <w:t>{%p if (not create_counterclaim and not there_are_marital_children) or (create_counterclaim and counterclaim_type == “no_children”) %}</w:t>
+        <w:t xml:space="preserve">{%p if (not </w:t>
+      </w:r>
+      <w:proofErr w:type="spellStart"/>
+      <w:r>
+        <w:rPr>
+          <w:color w:val="1B1B1B"/>
+        </w:rPr>
+        <w:t>create_counterclaim</w:t>
+      </w:r>
+      <w:proofErr w:type="spellEnd"/>
+      <w:r>
+        <w:rPr>
+          <w:color w:val="1B1B1B"/>
+        </w:rPr>
+        <w:t xml:space="preserve"> and not </w:t>
+      </w:r>
+      <w:proofErr w:type="spellStart"/>
+      <w:r>
+        <w:rPr>
+          <w:color w:val="1B1B1B"/>
+        </w:rPr>
+        <w:t>there_are_marital_children</w:t>
+      </w:r>
+      <w:proofErr w:type="spellEnd"/>
+      <w:r>
+        <w:rPr>
+          <w:color w:val="1B1B1B"/>
+        </w:rPr>
+        <w:t>) or (</w:t>
+      </w:r>
+      <w:proofErr w:type="spellStart"/>
+      <w:r>
+        <w:rPr>
+          <w:color w:val="1B1B1B"/>
+        </w:rPr>
+        <w:t>create_counterclaim</w:t>
+      </w:r>
+      <w:proofErr w:type="spellEnd"/>
+      <w:r>
+        <w:rPr>
+          <w:color w:val="1B1B1B"/>
+        </w:rPr>
+        <w:t xml:space="preserve"> and </w:t>
+      </w:r>
+      <w:proofErr w:type="spellStart"/>
+      <w:r>
+        <w:rPr>
+          <w:color w:val="1B1B1B"/>
+        </w:rPr>
+        <w:t>counterclaim_type</w:t>
+      </w:r>
+      <w:proofErr w:type="spellEnd"/>
+      <w:r>
+        <w:rPr>
+          <w:color w:val="1B1B1B"/>
+        </w:rPr>
+        <w:t xml:space="preserve"> == “</w:t>
+      </w:r>
+      <w:proofErr w:type="spellStart"/>
+      <w:r>
+        <w:rPr>
+          <w:color w:val="1B1B1B"/>
+        </w:rPr>
+        <w:t>no_children</w:t>
+      </w:r>
+      <w:proofErr w:type="spellEnd"/>
+      <w:r>
+        <w:rPr>
+          <w:color w:val="1B1B1B"/>
+        </w:rPr>
+        <w:t>”) %}</w:t>
       </w:r>
     </w:p>
     <w:p>
@@ -2111,7 +2770,77 @@
         <w:rPr>
           <w:color w:val="1B1B1B"/>
         </w:rPr>
-        <w:t>{%p if (not create_counterclaim and not there_are_marital_children) or (create_counterclaim and counterclaim_type == “no_children”) %}</w:t>
+        <w:t xml:space="preserve">{%p if (not </w:t>
+      </w:r>
+      <w:proofErr w:type="spellStart"/>
+      <w:r>
+        <w:rPr>
+          <w:color w:val="1B1B1B"/>
+        </w:rPr>
+        <w:t>create_counterclaim</w:t>
+      </w:r>
+      <w:proofErr w:type="spellEnd"/>
+      <w:r>
+        <w:rPr>
+          <w:color w:val="1B1B1B"/>
+        </w:rPr>
+        <w:t xml:space="preserve"> and not </w:t>
+      </w:r>
+      <w:proofErr w:type="spellStart"/>
+      <w:r>
+        <w:rPr>
+          <w:color w:val="1B1B1B"/>
+        </w:rPr>
+        <w:t>there_are_marital_children</w:t>
+      </w:r>
+      <w:proofErr w:type="spellEnd"/>
+      <w:r>
+        <w:rPr>
+          <w:color w:val="1B1B1B"/>
+        </w:rPr>
+        <w:t>) or (</w:t>
+      </w:r>
+      <w:proofErr w:type="spellStart"/>
+      <w:r>
+        <w:rPr>
+          <w:color w:val="1B1B1B"/>
+        </w:rPr>
+        <w:t>create_counterclaim</w:t>
+      </w:r>
+      <w:proofErr w:type="spellEnd"/>
+      <w:r>
+        <w:rPr>
+          <w:color w:val="1B1B1B"/>
+        </w:rPr>
+        <w:t xml:space="preserve"> and </w:t>
+      </w:r>
+      <w:proofErr w:type="spellStart"/>
+      <w:r>
+        <w:rPr>
+          <w:color w:val="1B1B1B"/>
+        </w:rPr>
+        <w:t>counterclaim_type</w:t>
+      </w:r>
+      <w:proofErr w:type="spellEnd"/>
+      <w:r>
+        <w:rPr>
+          <w:color w:val="1B1B1B"/>
+        </w:rPr>
+        <w:t xml:space="preserve"> == “</w:t>
+      </w:r>
+      <w:proofErr w:type="spellStart"/>
+      <w:r>
+        <w:rPr>
+          <w:color w:val="1B1B1B"/>
+        </w:rPr>
+        <w:t>no_children</w:t>
+      </w:r>
+      <w:proofErr w:type="spellEnd"/>
+      <w:r>
+        <w:rPr>
+          <w:color w:val="1B1B1B"/>
+        </w:rPr>
+        <w:t>”) %}</w:t>
       </w:r>
     </w:p>
     <w:p>
@@ -2463,7 +3192,77 @@
         <w:rPr>
           <w:color w:val="1B1B1B"/>
         </w:rPr>
-        <w:t>{%p if (not create_counterclaim and not there_are_marital_children) or (create_counterclaim and counterclaim_type == “no_children”) %}</w:t>
+        <w:t xml:space="preserve">{%p if (not </w:t>
+      </w:r>
+      <w:proofErr w:type="spellStart"/>
+      <w:r>
+        <w:rPr>
+          <w:color w:val="1B1B1B"/>
+        </w:rPr>
+        <w:t>create_counterclaim</w:t>
+      </w:r>
+      <w:proofErr w:type="spellEnd"/>
+      <w:r>
+        <w:rPr>
+          <w:color w:val="1B1B1B"/>
+        </w:rPr>
+        <w:t xml:space="preserve"> and not </w:t>
+      </w:r>
+      <w:proofErr w:type="spellStart"/>
+      <w:r>
+        <w:rPr>
+          <w:color w:val="1B1B1B"/>
+        </w:rPr>
+        <w:t>there_are_marital_children</w:t>
+      </w:r>
+      <w:proofErr w:type="spellEnd"/>
+      <w:r>
+        <w:rPr>
+          <w:color w:val="1B1B1B"/>
+        </w:rPr>
+        <w:t>) or (</w:t>
+      </w:r>
+      <w:proofErr w:type="spellStart"/>
+      <w:r>
+        <w:rPr>
+          <w:color w:val="1B1B1B"/>
+        </w:rPr>
+        <w:t>create_counterclaim</w:t>
+      </w:r>
+      <w:proofErr w:type="spellEnd"/>
+      <w:r>
+        <w:rPr>
+          <w:color w:val="1B1B1B"/>
+        </w:rPr>
+        <w:t xml:space="preserve"> and </w:t>
+      </w:r>
+      <w:proofErr w:type="spellStart"/>
+      <w:r>
+        <w:rPr>
+          <w:color w:val="1B1B1B"/>
+        </w:rPr>
+        <w:t>counterclaim_type</w:t>
+      </w:r>
+      <w:proofErr w:type="spellEnd"/>
+      <w:r>
+        <w:rPr>
+          <w:color w:val="1B1B1B"/>
+        </w:rPr>
+        <w:t xml:space="preserve"> == “</w:t>
+      </w:r>
+      <w:proofErr w:type="spellStart"/>
+      <w:r>
+        <w:rPr>
+          <w:color w:val="1B1B1B"/>
+        </w:rPr>
+        <w:t>no_children</w:t>
+      </w:r>
+      <w:proofErr w:type="spellEnd"/>
+      <w:r>
+        <w:rPr>
+          <w:color w:val="1B1B1B"/>
+        </w:rPr>
+        <w:t>”) %}</w:t>
       </w:r>
     </w:p>
     <w:p>
@@ -2547,7 +3346,63 @@
         <w:rPr>
           <w:color w:val="222222"/>
         </w:rPr>
-        <w:t xml:space="preserve">If you used MiFILE to file documents electronically, MiFILE will also serve the documents electronically if the other party is using MiFILE. If you are not both using MiFILE, you will need to serve the documents by e-mail, if possible. If you or the other party can't do this, or if you are not sure, you can serve by regular mail or personal delivery. If you serve by mail, send the papers to the other party’s last known address. </w:t>
+        <w:t xml:space="preserve">If you used </w:t>
+      </w:r>
+      <w:proofErr w:type="spellStart"/>
+      <w:r>
+        <w:rPr>
+          <w:color w:val="222222"/>
+        </w:rPr>
+        <w:t>MiFILE</w:t>
+      </w:r>
+      <w:proofErr w:type="spellEnd"/>
+      <w:r>
+        <w:rPr>
+          <w:color w:val="222222"/>
+        </w:rPr>
+        <w:t xml:space="preserve"> to file documents electronically, </w:t>
+      </w:r>
+      <w:proofErr w:type="spellStart"/>
+      <w:r>
+        <w:rPr>
+          <w:color w:val="222222"/>
+        </w:rPr>
+        <w:t>MiFILE</w:t>
+      </w:r>
+      <w:proofErr w:type="spellEnd"/>
+      <w:r>
+        <w:rPr>
+          <w:color w:val="222222"/>
+        </w:rPr>
+        <w:t xml:space="preserve"> will also serve the documents electronically if the other party is using </w:t>
+      </w:r>
+      <w:proofErr w:type="spellStart"/>
+      <w:r>
+        <w:rPr>
+          <w:color w:val="222222"/>
+        </w:rPr>
+        <w:t>MiFILE</w:t>
+      </w:r>
+      <w:proofErr w:type="spellEnd"/>
+      <w:r>
+        <w:rPr>
+          <w:color w:val="222222"/>
+        </w:rPr>
+        <w:t xml:space="preserve">. If you are not both using </w:t>
+      </w:r>
+      <w:proofErr w:type="spellStart"/>
+      <w:r>
+        <w:rPr>
+          <w:color w:val="222222"/>
+        </w:rPr>
+        <w:t>MiFILE</w:t>
+      </w:r>
+      <w:proofErr w:type="spellEnd"/>
+      <w:r>
+        <w:rPr>
+          <w:color w:val="222222"/>
+        </w:rPr>
+        <w:t xml:space="preserve">, you will need to serve the documents by e-mail, if possible. If you or the other party can't do this, or if you are not sure, you can serve by regular mail or personal delivery. If you serve by mail, send the papers to the other party’s last known address. </w:t>
       </w:r>
     </w:p>
     <w:p>
@@ -2688,7 +3543,39 @@
           <w:color w:val="222222"/>
           <w:highlight w:val="white"/>
         </w:rPr>
-        <w:t>If you served the other party using MiFILE, you will not need to file a Proof of Service. MiFILE will create and file a Proof of Service for you.</w:t>
+        <w:t xml:space="preserve">If you served the other party using </w:t>
+      </w:r>
+      <w:proofErr w:type="spellStart"/>
+      <w:r>
+        <w:rPr>
+          <w:color w:val="222222"/>
+          <w:highlight w:val="white"/>
+        </w:rPr>
+        <w:t>MiFILE</w:t>
+      </w:r>
+      <w:proofErr w:type="spellEnd"/>
+      <w:r>
+        <w:rPr>
+          <w:color w:val="222222"/>
+          <w:highlight w:val="white"/>
+        </w:rPr>
+        <w:t xml:space="preserve">, you will not need to file a Proof of Service. </w:t>
+      </w:r>
+      <w:proofErr w:type="spellStart"/>
+      <w:r>
+        <w:rPr>
+          <w:color w:val="222222"/>
+          <w:highlight w:val="white"/>
+        </w:rPr>
+        <w:t>MiFILE</w:t>
+      </w:r>
+      <w:proofErr w:type="spellEnd"/>
+      <w:r>
+        <w:rPr>
+          <w:color w:val="222222"/>
+          <w:highlight w:val="white"/>
+        </w:rPr>
+        <w:t xml:space="preserve"> will create and file a Proof of Service for you.</w:t>
       </w:r>
     </w:p>
     <w:p>
@@ -2719,7 +3606,21 @@
           <w:color w:val="222222"/>
           <w:highlight w:val="white"/>
         </w:rPr>
-        <w:t>. Fill in the date of service and who you served (the plaintiff or their attorney). Check the boxes next to the names of the forms you served and indicate which method of service you used. Date and sign the Proof of Service and file it</w:t>
+        <w:t>. Fill in the date of service and who you served (</w:t>
+      </w:r>
+      <w:r>
+        <w:rPr>
+          <w:color w:val="222222"/>
+          <w:highlight w:val="white"/>
+        </w:rPr>
+        <w:t>your spouse</w:t>
+      </w:r>
+      <w:r>
+        <w:rPr>
+          <w:color w:val="222222"/>
+          <w:highlight w:val="white"/>
+        </w:rPr>
+        <w:t xml:space="preserve"> or their attorney). Check the boxes next to the names of the forms you served and indicate which method of service you used. Date and sign the Proof of Service and file it</w:t>
       </w:r>
       <w:r>
         <w:rPr>
@@ -2734,7 +3635,28 @@
         <w:rPr>
           <w:color w:val="222222"/>
         </w:rPr>
-        <w:t xml:space="preserve">{% if county_choice </w:t>
+        <w:t xml:space="preserve">{% if </w:t>
+      </w:r>
+      <w:proofErr w:type="spellStart"/>
+      <w:r>
+        <w:rPr>
+          <w:color w:val="222222"/>
+        </w:rPr>
+        <w:t>county_</w:t>
+      </w:r>
+      <w:proofErr w:type="gramStart"/>
+      <w:r>
+        <w:rPr>
+          <w:color w:val="222222"/>
+        </w:rPr>
+        <w:t>choice</w:t>
+      </w:r>
+      <w:proofErr w:type="spellEnd"/>
+      <w:r>
+        <w:rPr>
+          <w:color w:val="222222"/>
+        </w:rPr>
+        <w:t xml:space="preserve"> </w:t>
       </w:r>
       <w:r>
         <w:rPr>
@@ -2742,24 +3664,96 @@
         </w:rPr>
         <w:t>!</w:t>
       </w:r>
-      <w:r>
-        <w:rPr>
-          <w:color w:val="222222"/>
-        </w:rPr>
-        <w:t>= “Oakland” %}</w:t>
-      </w:r>
-      <w:r>
-        <w:rPr>
-          <w:color w:val="222222"/>
-        </w:rPr>
-        <w:t xml:space="preserve">{% if </w:t>
-      </w:r>
-      <w:r>
-        <w:rPr>
-          <w:color w:val="222222"/>
-        </w:rPr>
-        <w:t>(not create_counterclaim and there_are_marital_children) or (create_counterclaim and counterclaim_type == “</w:t>
-      </w:r>
+      <w:proofErr w:type="gramEnd"/>
+      <w:r>
+        <w:rPr>
+          <w:color w:val="222222"/>
+        </w:rPr>
+        <w:t xml:space="preserve">= “Oakland” </w:t>
+      </w:r>
+      <w:proofErr w:type="gramStart"/>
+      <w:r>
+        <w:rPr>
+          <w:color w:val="222222"/>
+        </w:rPr>
+        <w:t>%}</w:t>
+      </w:r>
+      <w:r>
+        <w:rPr>
+          <w:color w:val="222222"/>
+        </w:rPr>
+        <w:t>{</w:t>
+      </w:r>
+      <w:proofErr w:type="gramEnd"/>
+      <w:r>
+        <w:rPr>
+          <w:color w:val="222222"/>
+        </w:rPr>
+        <w:t xml:space="preserve">% if </w:t>
+      </w:r>
+      <w:r>
+        <w:rPr>
+          <w:color w:val="222222"/>
+        </w:rPr>
+        <w:t xml:space="preserve">(not </w:t>
+      </w:r>
+      <w:proofErr w:type="spellStart"/>
+      <w:r>
+        <w:rPr>
+          <w:color w:val="222222"/>
+        </w:rPr>
+        <w:t>create_counterclaim</w:t>
+      </w:r>
+      <w:proofErr w:type="spellEnd"/>
+      <w:r>
+        <w:rPr>
+          <w:color w:val="222222"/>
+        </w:rPr>
+        <w:t xml:space="preserve"> and </w:t>
+      </w:r>
+      <w:proofErr w:type="spellStart"/>
+      <w:r>
+        <w:rPr>
+          <w:color w:val="222222"/>
+        </w:rPr>
+        <w:t>there_are_marital_children</w:t>
+      </w:r>
+      <w:proofErr w:type="spellEnd"/>
+      <w:r>
+        <w:rPr>
+          <w:color w:val="222222"/>
+        </w:rPr>
+        <w:t>) or (</w:t>
+      </w:r>
+      <w:proofErr w:type="spellStart"/>
+      <w:r>
+        <w:rPr>
+          <w:color w:val="222222"/>
+        </w:rPr>
+        <w:t>create_counterclaim</w:t>
+      </w:r>
+      <w:proofErr w:type="spellEnd"/>
+      <w:r>
+        <w:rPr>
+          <w:color w:val="222222"/>
+        </w:rPr>
+        <w:t xml:space="preserve"> and </w:t>
+      </w:r>
+      <w:proofErr w:type="spellStart"/>
+      <w:r>
+        <w:rPr>
+          <w:color w:val="222222"/>
+        </w:rPr>
+        <w:t>counterclaim_type</w:t>
+      </w:r>
+      <w:proofErr w:type="spellEnd"/>
+      <w:r>
+        <w:rPr>
+          <w:color w:val="222222"/>
+        </w:rPr>
+        <w:t xml:space="preserve"> == “</w:t>
+      </w:r>
+      <w:proofErr w:type="spellStart"/>
       <w:r>
         <w:rPr>
           <w:color w:val="222222"/>
@@ -2770,7 +3764,14 @@
         <w:rPr>
           <w:color w:val="222222"/>
         </w:rPr>
-        <w:t>_children”) %}</w:t>
+        <w:t>_children</w:t>
+      </w:r>
+      <w:proofErr w:type="spellEnd"/>
+      <w:r>
+        <w:rPr>
+          <w:color w:val="222222"/>
+        </w:rPr>
+        <w:t>”) %}</w:t>
       </w:r>
       <w:r>
         <w:rPr>
@@ -2797,7 +3798,21 @@
         <w:rPr>
           <w:color w:val="222222"/>
         </w:rPr>
-        <w:t>, and make a copy for your records.{% else %}</w:t>
+        <w:t xml:space="preserve">, and make a copy for your </w:t>
+      </w:r>
+      <w:proofErr w:type="gramStart"/>
+      <w:r>
+        <w:rPr>
+          <w:color w:val="222222"/>
+        </w:rPr>
+        <w:t>records.{</w:t>
+      </w:r>
+      <w:proofErr w:type="gramEnd"/>
+      <w:r>
+        <w:rPr>
+          <w:color w:val="222222"/>
+        </w:rPr>
+        <w:t>% else %}</w:t>
       </w:r>
       <w:r>
         <w:rPr>
@@ -2855,14 +3870,30 @@
           <w:color w:val="222222"/>
           <w:highlight w:val="white"/>
         </w:rPr>
-        <w:t>{% endif %}</w:t>
-      </w:r>
-      <w:r>
-        <w:rPr>
-          <w:color w:val="222222"/>
-          <w:highlight w:val="white"/>
-        </w:rPr>
-        <w:t>{% endif %}</w:t>
+        <w:t xml:space="preserve">{% endif </w:t>
+      </w:r>
+      <w:proofErr w:type="gramStart"/>
+      <w:r>
+        <w:rPr>
+          <w:color w:val="222222"/>
+          <w:highlight w:val="white"/>
+        </w:rPr>
+        <w:t>%}</w:t>
+      </w:r>
+      <w:r>
+        <w:rPr>
+          <w:color w:val="222222"/>
+          <w:highlight w:val="white"/>
+        </w:rPr>
+        <w:t>{</w:t>
+      </w:r>
+      <w:proofErr w:type="gramEnd"/>
+      <w:r>
+        <w:rPr>
+          <w:color w:val="222222"/>
+          <w:highlight w:val="white"/>
+        </w:rPr>
+        <w:t>% endif %}</w:t>
       </w:r>
       <w:r>
         <w:rPr>
@@ -3003,7 +4034,23 @@
           <w:bCs/>
           <w:color w:val="222222"/>
         </w:rPr>
-        <w:t xml:space="preserve">Within 28 days after you serve the plaintiff with your Answer, </w:t>
+        <w:t xml:space="preserve">Within 28 days after you serve </w:t>
+      </w:r>
+      <w:r>
+        <w:rPr>
+          <w:b/>
+          <w:bCs/>
+          <w:color w:val="222222"/>
+        </w:rPr>
+        <w:t>your spouse</w:t>
+      </w:r>
+      <w:r>
+        <w:rPr>
+          <w:b/>
+          <w:bCs/>
+          <w:color w:val="222222"/>
+        </w:rPr>
+        <w:t xml:space="preserve"> with your Answer, </w:t>
       </w:r>
     </w:p>
     <w:p>
@@ -3151,7 +4198,33 @@
         <w:rPr>
           <w:color w:val="222222"/>
         </w:rPr>
-        <w:t xml:space="preserve"> at the first scheduled hearing instead of mailing it, unless you and the plaintiff agree otherwise or the court directs otherwise. If you leave out information, you must explain the reasons why in a sworn affidavit and file it with the court within 28 days after you serve the Answer.</w:t>
+        <w:t xml:space="preserve"> at the first scheduled hearing instead of mailing it, unless you and </w:t>
+      </w:r>
+      <w:r>
+        <w:rPr>
+          <w:color w:val="222222"/>
+        </w:rPr>
+        <w:t>your spouse</w:t>
+      </w:r>
+      <w:r>
+        <w:rPr>
+          <w:color w:val="222222"/>
+        </w:rPr>
+        <w:t xml:space="preserve"> agree otherwise or the court directs otherwise. If you leave out information, you must explain the reasons why in </w:t>
+      </w:r>
+      <w:proofErr w:type="gramStart"/>
+      <w:r>
+        <w:rPr>
+          <w:color w:val="222222"/>
+        </w:rPr>
+        <w:t>a sworn affidavit</w:t>
+      </w:r>
+      <w:proofErr w:type="gramEnd"/>
+      <w:r>
+        <w:rPr>
+          <w:color w:val="222222"/>
+        </w:rPr>
+        <w:t xml:space="preserve"> and file it with the court within 28 days after you serve the Answer.</w:t>
       </w:r>
     </w:p>
     <w:p>
@@ -3288,19 +4361,47 @@
         <w:rPr>
           <w:color w:val="222222"/>
         </w:rPr>
-        <w:t xml:space="preserve"> after serving the form. If you served by e-mail, cross out “first-class mail” and write "e-mail." In the space for the other party's address, write the e-mail address instead.</w:t>
-      </w:r>
-      <w:r>
-        <w:rPr>
-          <w:color w:val="222222"/>
-        </w:rPr>
-        <w:t xml:space="preserve">{% </w:t>
-      </w:r>
-      <w:r>
-        <w:rPr>
-          <w:color w:val="222222"/>
-        </w:rPr>
-        <w:t>if county_choice == “Oakland” %}</w:t>
+        <w:t xml:space="preserve"> after serving the form. If you served by e-mail, cross out “first-class mail” and write "e-mail." In the space for the other party's address, write the e-mail address </w:t>
+      </w:r>
+      <w:proofErr w:type="gramStart"/>
+      <w:r>
+        <w:rPr>
+          <w:color w:val="222222"/>
+        </w:rPr>
+        <w:t>instead.</w:t>
+      </w:r>
+      <w:r>
+        <w:rPr>
+          <w:color w:val="222222"/>
+        </w:rPr>
+        <w:t>{</w:t>
+      </w:r>
+      <w:proofErr w:type="gramEnd"/>
+      <w:r>
+        <w:rPr>
+          <w:color w:val="222222"/>
+        </w:rPr>
+        <w:t xml:space="preserve">% </w:t>
+      </w:r>
+      <w:r>
+        <w:rPr>
+          <w:color w:val="222222"/>
+        </w:rPr>
+        <w:t xml:space="preserve">if </w:t>
+      </w:r>
+      <w:proofErr w:type="spellStart"/>
+      <w:r>
+        <w:rPr>
+          <w:color w:val="222222"/>
+        </w:rPr>
+        <w:t>county_choice</w:t>
+      </w:r>
+      <w:proofErr w:type="spellEnd"/>
+      <w:r>
+        <w:rPr>
+          <w:color w:val="222222"/>
+        </w:rPr>
+        <w:t xml:space="preserve"> == “Oakland” %}</w:t>
       </w:r>
       <w:r>
         <w:rPr>
@@ -3312,13 +4413,35 @@
         <w:rPr>
           <w:color w:val="222222"/>
         </w:rPr>
-        <w:t>File the Proof of Mailing in MiFILE.</w:t>
-      </w:r>
-      <w:r>
-        <w:rPr>
-          <w:color w:val="222222"/>
-        </w:rPr>
-        <w:t>{% else %}</w:t>
+        <w:t xml:space="preserve">File the Proof of Mailing in </w:t>
+      </w:r>
+      <w:proofErr w:type="spellStart"/>
+      <w:proofErr w:type="gramStart"/>
+      <w:r>
+        <w:rPr>
+          <w:color w:val="222222"/>
+        </w:rPr>
+        <w:t>MiFILE</w:t>
+      </w:r>
+      <w:proofErr w:type="spellEnd"/>
+      <w:r>
+        <w:rPr>
+          <w:color w:val="222222"/>
+        </w:rPr>
+        <w:t>.</w:t>
+      </w:r>
+      <w:r>
+        <w:rPr>
+          <w:color w:val="222222"/>
+        </w:rPr>
+        <w:t>{</w:t>
+      </w:r>
+      <w:proofErr w:type="gramEnd"/>
+      <w:r>
+        <w:rPr>
+          <w:color w:val="222222"/>
+        </w:rPr>
+        <w:t>% else %}</w:t>
       </w:r>
       <w:r>
         <w:rPr>
@@ -3330,13 +4453,27 @@
         <w:rPr>
           <w:color w:val="222222"/>
         </w:rPr>
-        <w:t>If you are filing in person at the court clerk's office, also file a copy of the Proof of Mailing for the Friend of the Court if your court requires FOC copies. Get a copy of the Proof of Mailing for your records.</w:t>
-      </w:r>
-      <w:r>
-        <w:rPr>
-          <w:color w:val="222222"/>
-        </w:rPr>
-        <w:t>{% endif %}</w:t>
+        <w:t xml:space="preserve">If you are filing in person at the court clerk's office, also file a copy of the Proof of Mailing for the Friend of the Court if your court requires FOC copies. Get a copy of the Proof of Mailing for your </w:t>
+      </w:r>
+      <w:proofErr w:type="gramStart"/>
+      <w:r>
+        <w:rPr>
+          <w:color w:val="222222"/>
+        </w:rPr>
+        <w:t>records.</w:t>
+      </w:r>
+      <w:r>
+        <w:rPr>
+          <w:color w:val="222222"/>
+        </w:rPr>
+        <w:t>{</w:t>
+      </w:r>
+      <w:proofErr w:type="gramEnd"/>
+      <w:r>
+        <w:rPr>
+          <w:color w:val="222222"/>
+        </w:rPr>
+        <w:t>% endif %}</w:t>
       </w:r>
     </w:p>
     <w:p>
@@ -3411,7 +4548,97 @@
           <w:bCs/>
           <w:color w:val="222222"/>
         </w:rPr>
-        <w:t>if (not create_counterclaim and there_are_marital_children) or (create_counterclaim and counterclaim_type == “with_children”)</w:t>
+        <w:t xml:space="preserve">if (not </w:t>
+      </w:r>
+      <w:proofErr w:type="spellStart"/>
+      <w:r>
+        <w:rPr>
+          <w:b/>
+          <w:bCs/>
+          <w:color w:val="222222"/>
+        </w:rPr>
+        <w:t>create_counterclaim</w:t>
+      </w:r>
+      <w:proofErr w:type="spellEnd"/>
+      <w:r>
+        <w:rPr>
+          <w:b/>
+          <w:bCs/>
+          <w:color w:val="222222"/>
+        </w:rPr>
+        <w:t xml:space="preserve"> and </w:t>
+      </w:r>
+      <w:proofErr w:type="spellStart"/>
+      <w:r>
+        <w:rPr>
+          <w:b/>
+          <w:bCs/>
+          <w:color w:val="222222"/>
+        </w:rPr>
+        <w:t>there_are_marital_children</w:t>
+      </w:r>
+      <w:proofErr w:type="spellEnd"/>
+      <w:r>
+        <w:rPr>
+          <w:b/>
+          <w:bCs/>
+          <w:color w:val="222222"/>
+        </w:rPr>
+        <w:t>) or (</w:t>
+      </w:r>
+      <w:proofErr w:type="spellStart"/>
+      <w:r>
+        <w:rPr>
+          <w:b/>
+          <w:bCs/>
+          <w:color w:val="222222"/>
+        </w:rPr>
+        <w:t>create_counterclaim</w:t>
+      </w:r>
+      <w:proofErr w:type="spellEnd"/>
+      <w:r>
+        <w:rPr>
+          <w:b/>
+          <w:bCs/>
+          <w:color w:val="222222"/>
+        </w:rPr>
+        <w:t xml:space="preserve"> and </w:t>
+      </w:r>
+      <w:proofErr w:type="spellStart"/>
+      <w:r>
+        <w:rPr>
+          <w:b/>
+          <w:bCs/>
+          <w:color w:val="222222"/>
+        </w:rPr>
+        <w:t>counterclaim_type</w:t>
+      </w:r>
+      <w:proofErr w:type="spellEnd"/>
+      <w:r>
+        <w:rPr>
+          <w:b/>
+          <w:bCs/>
+          <w:color w:val="222222"/>
+        </w:rPr>
+        <w:t xml:space="preserve"> == “</w:t>
+      </w:r>
+      <w:proofErr w:type="spellStart"/>
+      <w:r>
+        <w:rPr>
+          <w:b/>
+          <w:bCs/>
+          <w:color w:val="222222"/>
+        </w:rPr>
+        <w:t>with_children</w:t>
+      </w:r>
+      <w:proofErr w:type="spellEnd"/>
+      <w:r>
+        <w:rPr>
+          <w:b/>
+          <w:bCs/>
+          <w:color w:val="222222"/>
+        </w:rPr>
+        <w:t>”)</w:t>
       </w:r>
       <w:r>
         <w:rPr>
@@ -3539,7 +4766,7 @@
 </file>
 
 <file path=word/numbering.xml><?xml version="1.0" encoding="utf-8"?>
-<w:numbering xmlns:wpc="http://schemas.microsoft.com/office/word/2010/wordprocessingCanvas" xmlns:cx="http://schemas.microsoft.com/office/drawing/2014/chartex" xmlns:cx1="http://schemas.microsoft.com/office/drawing/2015/9/8/chartex" xmlns:cx2="http://schemas.microsoft.com/office/drawing/2015/10/21/chartex" xmlns:cx3="http://schemas.microsoft.com/office/drawing/2016/5/9/chartex" xmlns:cx4="http://schemas.microsoft.com/office/drawing/2016/5/10/chartex" xmlns:cx5="http://schemas.microsoft.com/office/drawing/2016/5/11/chartex" xmlns:cx6="http://schemas.microsoft.com/office/drawing/2016/5/12/chartex" xmlns:cx7="http://schemas.microsoft.com/office/drawing/2016/5/13/chartex" xmlns:cx8="http://schemas.microsoft.com/office/drawing/2016/5/14/chartex" xmlns:mc="http://schemas.openxmlformats.org/markup-compatibility/2006" xmlns:aink="http://schemas.microsoft.com/office/drawing/2016/ink" xmlns:am3d="http://schemas.microsoft.com/office/drawing/2017/model3d" xmlns:o="urn:schemas-microsoft-com:office:office" xmlns:oel="http://schemas.microsoft.com/office/2019/extlst" xmlns:r="http://schemas.openxmlformats.org/officeDocument/2006/relationships" xmlns:m="http://schemas.openxmlformats.org/officeDocument/2006/math" xmlns:v="urn:schemas-microsoft-com:vml" xmlns:wp14="http://schemas.microsoft.com/office/word/2010/wordprocessingDrawing" xmlns:wp="http://schemas.openxmlformats.org/drawingml/2006/wordprocessingDrawing" xmlns:w10="urn:schemas-microsoft-com:office:word" xmlns:w="http://schemas.openxmlformats.org/wordprocessingml/2006/main" xmlns:w14="http://schemas.microsoft.com/office/word/2010/wordml" xmlns:w15="http://schemas.microsoft.com/office/word/2012/wordml" xmlns:w16cex="http://schemas.microsoft.com/office/word/2018/wordml/cex" xmlns:w16cid="http://schemas.microsoft.com/office/word/2016/wordml/cid" xmlns:w16="http://schemas.microsoft.com/office/word/2018/wordml" xmlns:w16du="http://schemas.microsoft.com/office/word/2023/wordml/word16du" xmlns:w16sdtdh="http://schemas.microsoft.com/office/word/2020/wordml/sdtdatahash" xmlns:w16sdtfl="http://schemas.microsoft.com/office/word/2024/wordml/sdtformatlock" xmlns:w16se="http://schemas.microsoft.com/office/word/2015/wordml/symex" xmlns:wpg="http://schemas.microsoft.com/office/word/2010/wordprocessingGroup" xmlns:wpi="http://schemas.microsoft.com/office/word/2010/wordprocessingInk" xmlns:wne="http://schemas.microsoft.com/office/word/2006/wordml" xmlns:wps="http://schemas.microsoft.com/office/word/2010/wordprocessingShape" mc:Ignorable="w14 w15 w16se w16cid w16 w16cex w16sdtdh w16sdtfl w16du wp14">
+<w:numbering xmlns:wpc="http://schemas.microsoft.com/office/word/2010/wordprocessingCanvas" xmlns:cx="http://schemas.microsoft.com/office/drawing/2014/chartex" xmlns:cx1="http://schemas.microsoft.com/office/drawing/2015/9/8/chartex" xmlns:cx2="http://schemas.microsoft.com/office/drawing/2015/10/21/chartex" xmlns:cx3="http://schemas.microsoft.com/office/drawing/2016/5/9/chartex" xmlns:cx4="http://schemas.microsoft.com/office/drawing/2016/5/10/chartex" xmlns:cx5="http://schemas.microsoft.com/office/drawing/2016/5/11/chartex" xmlns:cx6="http://schemas.microsoft.com/office/drawing/2016/5/12/chartex" xmlns:cx7="http://schemas.microsoft.com/office/drawing/2016/5/13/chartex" xmlns:cx8="http://schemas.microsoft.com/office/drawing/2016/5/14/chartex" xmlns:mc="http://schemas.openxmlformats.org/markup-compatibility/2006" xmlns:m="http://schemas.openxmlformats.org/officeDocument/2006/math" xmlns:aink="http://schemas.microsoft.com/office/drawing/2016/ink" xmlns:am3d="http://schemas.microsoft.com/office/drawing/2017/model3d" xmlns:oel="http://schemas.microsoft.com/office/2019/extlst" xmlns:r="http://schemas.openxmlformats.org/officeDocument/2006/relationships" xmlns:wp14="http://schemas.microsoft.com/office/word/2010/wordprocessingDrawing" xmlns:wp="http://schemas.openxmlformats.org/drawingml/2006/wordprocessingDrawing" xmlns:wpg="http://schemas.microsoft.com/office/word/2010/wordprocessingGroup" xmlns:wpi="http://schemas.microsoft.com/office/word/2010/wordprocessingInk" xmlns:wps="http://schemas.microsoft.com/office/word/2010/wordprocessingShape" xmlns:o="urn:schemas-microsoft-com:office:office" xmlns:v="urn:schemas-microsoft-com:vml" xmlns:w10="urn:schemas-microsoft-com:office:word" xmlns:w="http://schemas.openxmlformats.org/wordprocessingml/2006/main" xmlns:w14="http://schemas.microsoft.com/office/word/2010/wordml" xmlns:w15="http://schemas.microsoft.com/office/word/2012/wordml" xmlns:w16cei="http://schemas.microsoft.com/office/word/2026/wordml/cei" xmlns:w16cex="http://schemas.microsoft.com/office/word/2018/wordml/cex" xmlns:w16cid="http://schemas.microsoft.com/office/word/2016/wordml/cid" xmlns:w16="http://schemas.microsoft.com/office/word/2018/wordml" xmlns:w16sdtdh="http://schemas.microsoft.com/office/word/2020/wordml/sdtdatahash" xmlns:w16sdtfl="http://schemas.microsoft.com/office/word/2024/wordml/sdtformatlock" xmlns:w16se="http://schemas.microsoft.com/office/word/2015/wordml/symex" xmlns:w16du="http://schemas.microsoft.com/office/word/2023/wordml/word16du" xmlns:wne="http://schemas.microsoft.com/office/word/2006/wordml" mc:Ignorable="w14 w15 w16se w16cid w16 w16cex w16sdtdh w16sdtfl w16du wp14">
   <w:abstractNum w:abstractNumId="0" w15:restartNumberingAfterBreak="0">
     <w:nsid w:val="0AFF7FFD"/>
     <w:multiLevelType w:val="multilevel"/>
@@ -6011,7 +7238,7 @@
 </file>
 
 <file path=word/styles.xml><?xml version="1.0" encoding="utf-8"?>
-<w:styles xmlns:mc="http://schemas.openxmlformats.org/markup-compatibility/2006" xmlns:r="http://schemas.openxmlformats.org/officeDocument/2006/relationships" xmlns:w="http://schemas.openxmlformats.org/wordprocessingml/2006/main" xmlns:w14="http://schemas.microsoft.com/office/word/2010/wordml" xmlns:w15="http://schemas.microsoft.com/office/word/2012/wordml" xmlns:w16cex="http://schemas.microsoft.com/office/word/2018/wordml/cex" xmlns:w16cid="http://schemas.microsoft.com/office/word/2016/wordml/cid" xmlns:w16="http://schemas.microsoft.com/office/word/2018/wordml" xmlns:w16du="http://schemas.microsoft.com/office/word/2023/wordml/word16du" xmlns:w16sdtdh="http://schemas.microsoft.com/office/word/2020/wordml/sdtdatahash" xmlns:w16sdtfl="http://schemas.microsoft.com/office/word/2024/wordml/sdtformatlock" xmlns:w16se="http://schemas.microsoft.com/office/word/2015/wordml/symex" mc:Ignorable="w14 w15 w16se w16cid w16 w16cex w16sdtdh w16sdtfl w16du">
+<w:styles xmlns:mc="http://schemas.openxmlformats.org/markup-compatibility/2006" xmlns:r="http://schemas.openxmlformats.org/officeDocument/2006/relationships" xmlns:w="http://schemas.openxmlformats.org/wordprocessingml/2006/main" xmlns:w14="http://schemas.microsoft.com/office/word/2010/wordml" xmlns:w15="http://schemas.microsoft.com/office/word/2012/wordml" xmlns:w16cex="http://schemas.microsoft.com/office/word/2018/wordml/cex" xmlns:w16cid="http://schemas.microsoft.com/office/word/2016/wordml/cid" xmlns:w16="http://schemas.microsoft.com/office/word/2018/wordml" xmlns:w16sdtdh="http://schemas.microsoft.com/office/word/2020/wordml/sdtdatahash" xmlns:w16sdtfl="http://schemas.microsoft.com/office/word/2024/wordml/sdtformatlock" xmlns:w16se="http://schemas.microsoft.com/office/word/2015/wordml/symex" xmlns:w16du="http://schemas.microsoft.com/office/word/2023/wordml/word16du" mc:Ignorable="w14 w15 w16se w16cid w16 w16cex w16sdtdh w16sdtfl w16du">
   <w:docDefaults>
     <w:rPrDefault>
       <w:rPr>

</xml_diff>

<commit_message>
Revert "answer interview order updates and answer instruction language edits"
</commit_message>
<xml_diff>
--- a/docassemble/MLHDivorceAndCustody/data/templates/instructions_divorce_answer.docx
+++ b/docassemble/MLHDivorceAndCustody/data/templates/instructions_divorce_answer.docx
@@ -1,6 +1,6 @@
 
 <file path=word/document.xml><?xml version="1.0" encoding="utf-8"?>
-<w:document xmlns:wpc="http://schemas.microsoft.com/office/word/2010/wordprocessingCanvas" xmlns:cx="http://schemas.microsoft.com/office/drawing/2014/chartex" xmlns:cx1="http://schemas.microsoft.com/office/drawing/2015/9/8/chartex" xmlns:cx2="http://schemas.microsoft.com/office/drawing/2015/10/21/chartex" xmlns:cx3="http://schemas.microsoft.com/office/drawing/2016/5/9/chartex" xmlns:cx4="http://schemas.microsoft.com/office/drawing/2016/5/10/chartex" xmlns:cx5="http://schemas.microsoft.com/office/drawing/2016/5/11/chartex" xmlns:cx6="http://schemas.microsoft.com/office/drawing/2016/5/12/chartex" xmlns:cx7="http://schemas.microsoft.com/office/drawing/2016/5/13/chartex" xmlns:cx8="http://schemas.microsoft.com/office/drawing/2016/5/14/chartex" xmlns:mc="http://schemas.openxmlformats.org/markup-compatibility/2006" xmlns:m="http://schemas.openxmlformats.org/officeDocument/2006/math" xmlns:aink="http://schemas.microsoft.com/office/drawing/2016/ink" xmlns:am3d="http://schemas.microsoft.com/office/drawing/2017/model3d" xmlns:oel="http://schemas.microsoft.com/office/2019/extlst" xmlns:r="http://schemas.openxmlformats.org/officeDocument/2006/relationships" xmlns:wp14="http://schemas.microsoft.com/office/word/2010/wordprocessingDrawing" xmlns:wp="http://schemas.openxmlformats.org/drawingml/2006/wordprocessingDrawing" xmlns:wpg="http://schemas.microsoft.com/office/word/2010/wordprocessingGroup" xmlns:wpi="http://schemas.microsoft.com/office/word/2010/wordprocessingInk" xmlns:wps="http://schemas.microsoft.com/office/word/2010/wordprocessingShape" xmlns:o="urn:schemas-microsoft-com:office:office" xmlns:v="urn:schemas-microsoft-com:vml" xmlns:w10="urn:schemas-microsoft-com:office:word" xmlns:w="http://schemas.openxmlformats.org/wordprocessingml/2006/main" xmlns:w14="http://schemas.microsoft.com/office/word/2010/wordml" xmlns:w15="http://schemas.microsoft.com/office/word/2012/wordml" xmlns:w16cei="http://schemas.microsoft.com/office/word/2026/wordml/cei" xmlns:w16cex="http://schemas.microsoft.com/office/word/2018/wordml/cex" xmlns:w16cid="http://schemas.microsoft.com/office/word/2016/wordml/cid" xmlns:w16="http://schemas.microsoft.com/office/word/2018/wordml" xmlns:w16sdtdh="http://schemas.microsoft.com/office/word/2020/wordml/sdtdatahash" xmlns:w16sdtfl="http://schemas.microsoft.com/office/word/2024/wordml/sdtformatlock" xmlns:w16se="http://schemas.microsoft.com/office/word/2015/wordml/symex" xmlns:w16du="http://schemas.microsoft.com/office/word/2023/wordml/word16du" xmlns:wne="http://schemas.microsoft.com/office/word/2006/wordml" mc:Ignorable="w14 w15 w16se w16cid w16 w16cex w16sdtdh w16sdtfl w16du wp14">
+<w:document xmlns:wpc="http://schemas.microsoft.com/office/word/2010/wordprocessingCanvas" xmlns:cx="http://schemas.microsoft.com/office/drawing/2014/chartex" xmlns:cx1="http://schemas.microsoft.com/office/drawing/2015/9/8/chartex" xmlns:cx2="http://schemas.microsoft.com/office/drawing/2015/10/21/chartex" xmlns:cx3="http://schemas.microsoft.com/office/drawing/2016/5/9/chartex" xmlns:cx4="http://schemas.microsoft.com/office/drawing/2016/5/10/chartex" xmlns:cx5="http://schemas.microsoft.com/office/drawing/2016/5/11/chartex" xmlns:cx6="http://schemas.microsoft.com/office/drawing/2016/5/12/chartex" xmlns:cx7="http://schemas.microsoft.com/office/drawing/2016/5/13/chartex" xmlns:cx8="http://schemas.microsoft.com/office/drawing/2016/5/14/chartex" xmlns:mc="http://schemas.openxmlformats.org/markup-compatibility/2006" xmlns:aink="http://schemas.microsoft.com/office/drawing/2016/ink" xmlns:am3d="http://schemas.microsoft.com/office/drawing/2017/model3d" xmlns:o="urn:schemas-microsoft-com:office:office" xmlns:oel="http://schemas.microsoft.com/office/2019/extlst" xmlns:r="http://schemas.openxmlformats.org/officeDocument/2006/relationships" xmlns:m="http://schemas.openxmlformats.org/officeDocument/2006/math" xmlns:v="urn:schemas-microsoft-com:vml" xmlns:wp14="http://schemas.microsoft.com/office/word/2010/wordprocessingDrawing" xmlns:wp="http://schemas.openxmlformats.org/drawingml/2006/wordprocessingDrawing" xmlns:w10="urn:schemas-microsoft-com:office:word" xmlns:w="http://schemas.openxmlformats.org/wordprocessingml/2006/main" xmlns:w14="http://schemas.microsoft.com/office/word/2010/wordml" xmlns:w15="http://schemas.microsoft.com/office/word/2012/wordml" xmlns:w16cex="http://schemas.microsoft.com/office/word/2018/wordml/cex" xmlns:w16cid="http://schemas.microsoft.com/office/word/2016/wordml/cid" xmlns:w16="http://schemas.microsoft.com/office/word/2018/wordml" xmlns:w16du="http://schemas.microsoft.com/office/word/2023/wordml/word16du" xmlns:w16sdtdh="http://schemas.microsoft.com/office/word/2020/wordml/sdtdatahash" xmlns:w16sdtfl="http://schemas.microsoft.com/office/word/2024/wordml/sdtformatlock" xmlns:w16se="http://schemas.microsoft.com/office/word/2015/wordml/symex" xmlns:wpg="http://schemas.microsoft.com/office/word/2010/wordprocessingGroup" xmlns:wpi="http://schemas.microsoft.com/office/word/2010/wordprocessingInk" xmlns:wne="http://schemas.microsoft.com/office/word/2006/wordml" xmlns:wps="http://schemas.microsoft.com/office/word/2010/wordprocessingShape" mc:Ignorable="w14 w15 w16se w16cid w16 w16cex w16sdtdh w16sdtfl w16du wp14">
   <w:body>
     <w:p>
       <w:pPr>
@@ -13,96 +13,16 @@
         <w:t xml:space="preserve"> Answer and Counterclaim to a Complaint for Divorce </w:t>
       </w:r>
       <w:r>
-        <w:t xml:space="preserve">{% if (not </w:t>
-      </w:r>
-      <w:proofErr w:type="spellStart"/>
-      <w:r>
-        <w:t>create_counterclaim</w:t>
-      </w:r>
-      <w:proofErr w:type="spellEnd"/>
-      <w:r>
-        <w:t xml:space="preserve"> and </w:t>
-      </w:r>
-      <w:proofErr w:type="spellStart"/>
-      <w:r>
-        <w:t>there_are_marital_children</w:t>
-      </w:r>
-      <w:proofErr w:type="spellEnd"/>
-      <w:r>
-        <w:t>) or (</w:t>
-      </w:r>
-      <w:proofErr w:type="spellStart"/>
-      <w:r>
-        <w:t>create_counterclaim</w:t>
-      </w:r>
-      <w:proofErr w:type="spellEnd"/>
-      <w:r>
-        <w:t xml:space="preserve"> and </w:t>
-      </w:r>
-      <w:proofErr w:type="spellStart"/>
-      <w:r>
-        <w:t>counterclaim_type</w:t>
-      </w:r>
-      <w:proofErr w:type="spellEnd"/>
-      <w:r>
-        <w:t xml:space="preserve"> == “</w:t>
-      </w:r>
-      <w:proofErr w:type="spellStart"/>
-      <w:r>
-        <w:t>with_children</w:t>
-      </w:r>
-      <w:proofErr w:type="spellEnd"/>
-      <w:r>
-        <w:t xml:space="preserve">”) </w:t>
-      </w:r>
-      <w:proofErr w:type="gramStart"/>
-      <w:r>
-        <w:t>%}</w:t>
-      </w:r>
-      <w:r>
-        <w:t>with</w:t>
-      </w:r>
-      <w:proofErr w:type="gramEnd"/>
-      <w:r>
-        <w:t xml:space="preserve">{% else </w:t>
-      </w:r>
-      <w:proofErr w:type="gramStart"/>
-      <w:r>
-        <w:t>%}without</w:t>
-      </w:r>
-      <w:proofErr w:type="gramEnd"/>
-      <w:r>
-        <w:t xml:space="preserve">{% endif %} </w:t>
+        <w:t>{% if (not create_counterclaim and there_are_marital_children) or (create_counterclaim and counterclaim_type == “with_children”) %}</w:t>
+      </w:r>
+      <w:r>
+        <w:t xml:space="preserve">with{% else %}without{% endif %} </w:t>
       </w:r>
       <w:r>
         <w:t>Children</w:t>
       </w:r>
       <w:r>
-        <w:t xml:space="preserve"> {% if </w:t>
-      </w:r>
-      <w:proofErr w:type="spellStart"/>
-      <w:r>
-        <w:t>county_choice</w:t>
-      </w:r>
-      <w:proofErr w:type="spellEnd"/>
-      <w:r>
-        <w:t xml:space="preserve"> == “Oakland” </w:t>
-      </w:r>
-      <w:proofErr w:type="gramStart"/>
-      <w:r>
-        <w:t>%}(</w:t>
-      </w:r>
-      <w:proofErr w:type="gramEnd"/>
-      <w:r>
-        <w:t xml:space="preserve">Oakland </w:t>
-      </w:r>
-      <w:proofErr w:type="gramStart"/>
-      <w:r>
-        <w:t>County){</w:t>
-      </w:r>
-      <w:proofErr w:type="gramEnd"/>
-      <w:r>
-        <w:t>% endif %}</w:t>
+        <w:t xml:space="preserve"> {% if county_choice == “Oakland” %}(Oakland County){% endif %}</w:t>
       </w:r>
     </w:p>
     <w:p>
@@ -140,97 +60,7 @@
           <w:bCs/>
           <w:color w:val="222222"/>
         </w:rPr>
-        <w:t xml:space="preserve">if (not </w:t>
-      </w:r>
-      <w:proofErr w:type="spellStart"/>
-      <w:r>
-        <w:rPr>
-          <w:b/>
-          <w:bCs/>
-          <w:color w:val="222222"/>
-        </w:rPr>
-        <w:t>create_counterclaim</w:t>
-      </w:r>
-      <w:proofErr w:type="spellEnd"/>
-      <w:r>
-        <w:rPr>
-          <w:b/>
-          <w:bCs/>
-          <w:color w:val="222222"/>
-        </w:rPr>
-        <w:t xml:space="preserve"> and </w:t>
-      </w:r>
-      <w:proofErr w:type="spellStart"/>
-      <w:r>
-        <w:rPr>
-          <w:b/>
-          <w:bCs/>
-          <w:color w:val="222222"/>
-        </w:rPr>
-        <w:t>there_are_marital_children</w:t>
-      </w:r>
-      <w:proofErr w:type="spellEnd"/>
-      <w:r>
-        <w:rPr>
-          <w:b/>
-          <w:bCs/>
-          <w:color w:val="222222"/>
-        </w:rPr>
-        <w:t>) or (</w:t>
-      </w:r>
-      <w:proofErr w:type="spellStart"/>
-      <w:r>
-        <w:rPr>
-          <w:b/>
-          <w:bCs/>
-          <w:color w:val="222222"/>
-        </w:rPr>
-        <w:t>create_counterclaim</w:t>
-      </w:r>
-      <w:proofErr w:type="spellEnd"/>
-      <w:r>
-        <w:rPr>
-          <w:b/>
-          <w:bCs/>
-          <w:color w:val="222222"/>
-        </w:rPr>
-        <w:t xml:space="preserve"> and </w:t>
-      </w:r>
-      <w:proofErr w:type="spellStart"/>
-      <w:r>
-        <w:rPr>
-          <w:b/>
-          <w:bCs/>
-          <w:color w:val="222222"/>
-        </w:rPr>
-        <w:t>counterclaim_type</w:t>
-      </w:r>
-      <w:proofErr w:type="spellEnd"/>
-      <w:r>
-        <w:rPr>
-          <w:b/>
-          <w:bCs/>
-          <w:color w:val="222222"/>
-        </w:rPr>
-        <w:t xml:space="preserve"> == “</w:t>
-      </w:r>
-      <w:proofErr w:type="spellStart"/>
-      <w:r>
-        <w:rPr>
-          <w:b/>
-          <w:bCs/>
-          <w:color w:val="222222"/>
-        </w:rPr>
-        <w:t>with_children</w:t>
-      </w:r>
-      <w:proofErr w:type="spellEnd"/>
-      <w:r>
-        <w:rPr>
-          <w:b/>
-          <w:bCs/>
-          <w:color w:val="222222"/>
-        </w:rPr>
-        <w:t>”)</w:t>
+        <w:t>if (not create_counterclaim and there_are_marital_children) or (create_counterclaim and counterclaim_type == “with_children”)</w:t>
       </w:r>
       <w:r>
         <w:rPr>
@@ -399,28 +229,7 @@
         <w:rPr>
           <w:color w:val="222222"/>
         </w:rPr>
-        <w:t xml:space="preserve">if </w:t>
-      </w:r>
-      <w:proofErr w:type="spellStart"/>
-      <w:r>
-        <w:rPr>
-          <w:color w:val="222222"/>
-        </w:rPr>
-        <w:t>county_</w:t>
-      </w:r>
-      <w:proofErr w:type="gramStart"/>
-      <w:r>
-        <w:rPr>
-          <w:color w:val="222222"/>
-        </w:rPr>
-        <w:t>choice</w:t>
-      </w:r>
-      <w:proofErr w:type="spellEnd"/>
-      <w:r>
-        <w:rPr>
-          <w:color w:val="222222"/>
-        </w:rPr>
-        <w:t xml:space="preserve"> </w:t>
+        <w:t xml:space="preserve">if county_choice </w:t>
       </w:r>
       <w:r>
         <w:rPr>
@@ -428,7 +237,6 @@
         </w:rPr>
         <w:t>!</w:t>
       </w:r>
-      <w:proofErr w:type="gramEnd"/>
       <w:r>
         <w:rPr>
           <w:color w:val="222222"/>
@@ -534,60 +342,77 @@
         <w:rPr>
           <w:color w:val="222222"/>
         </w:rPr>
-        <w:t xml:space="preserve">You will not file </w:t>
-      </w:r>
-      <w:proofErr w:type="gramStart"/>
-      <w:r>
-        <w:rPr>
-          <w:color w:val="222222"/>
-        </w:rPr>
-        <w:t>all of</w:t>
-      </w:r>
-      <w:proofErr w:type="gramEnd"/>
-      <w:r>
-        <w:rPr>
-          <w:color w:val="222222"/>
-        </w:rPr>
-        <w:t xml:space="preserve"> these forms at the beginning of your case; some you will use </w:t>
-      </w:r>
-      <w:proofErr w:type="gramStart"/>
-      <w:r>
-        <w:rPr>
-          <w:color w:val="222222"/>
-        </w:rPr>
-        <w:t>later.</w:t>
-      </w:r>
-      <w:r>
-        <w:rPr>
-          <w:color w:val="222222"/>
-        </w:rPr>
-        <w:t>{</w:t>
-      </w:r>
-      <w:proofErr w:type="gramEnd"/>
-      <w:r>
-        <w:rPr>
-          <w:color w:val="222222"/>
-        </w:rPr>
-        <w:t xml:space="preserve">% if </w:t>
-      </w:r>
-      <w:proofErr w:type="spellStart"/>
-      <w:r>
-        <w:rPr>
-          <w:color w:val="222222"/>
-        </w:rPr>
-        <w:t>county_choice</w:t>
-      </w:r>
-      <w:proofErr w:type="spellEnd"/>
-      <w:r>
-        <w:rPr>
-          <w:color w:val="222222"/>
-        </w:rPr>
+        <w:t>You will not file all of these forms at the beginning of your case; some you will use later.</w:t>
+      </w:r>
+      <w:r>
+        <w:rPr>
+          <w:color w:val="222222"/>
+        </w:rPr>
+        <w:t xml:space="preserve">{% if county_choice </w:t>
+      </w:r>
+      <w:r>
+        <w:rPr>
+          <w:color w:val="222222"/>
+        </w:rPr>
+        <w:t>=</w:t>
+      </w:r>
+      <w:r>
+        <w:rPr>
+          <w:color w:val="222222"/>
+        </w:rPr>
+        <w:t>= “Oakland” %}</w:t>
+      </w:r>
+      <w:r>
         <w:t xml:space="preserve"> </w:t>
       </w:r>
       <w:r>
         <w:rPr>
           <w:color w:val="222222"/>
         </w:rPr>
+        <w:t>The instructions below explain which forms you need for each step.</w:t>
+      </w:r>
+      <w:r>
+        <w:rPr>
+          <w:color w:val="222222"/>
+        </w:rPr>
+        <w:t xml:space="preserve"> {% else %} </w:t>
+      </w:r>
+      <w:r>
+        <w:rPr>
+          <w:color w:val="222222"/>
+        </w:rPr>
+        <w:t>You will need to make copies of some of the forms. The instructions below explain which forms you need for each step and how many copies to make.</w:t>
+      </w:r>
+      <w:r>
+        <w:rPr>
+          <w:color w:val="222222"/>
+        </w:rPr>
+        <w:t>{% endif %}</w:t>
+      </w:r>
+    </w:p>
+    <w:p>
+      <w:pPr>
+        <w:spacing w:after="0"/>
+        <w:rPr>
+          <w:color w:val="222222"/>
+        </w:rPr>
+      </w:pPr>
+      <w:r>
+        <w:rPr>
+          <w:color w:val="222222"/>
+        </w:rPr>
+        <w:t xml:space="preserve">{%p if </w:t>
+      </w:r>
+      <w:r>
+        <w:rPr>
+          <w:color w:val="222222"/>
+        </w:rPr>
+        <w:t xml:space="preserve">county_choice </w:t>
+      </w:r>
+      <w:r>
+        <w:rPr>
+          <w:color w:val="222222"/>
+        </w:rPr>
         <w:t>=</w:t>
       </w:r>
       <w:r>
@@ -596,47 +421,6 @@
         </w:rPr>
         <w:t>= “Oakland” %}</w:t>
       </w:r>
-      <w:r>
-        <w:t xml:space="preserve"> </w:t>
-      </w:r>
-      <w:r>
-        <w:rPr>
-          <w:color w:val="222222"/>
-        </w:rPr>
-        <w:t>The instructions below explain which forms you need for each step.</w:t>
-      </w:r>
-      <w:r>
-        <w:rPr>
-          <w:color w:val="222222"/>
-        </w:rPr>
-        <w:t xml:space="preserve"> {% else %} </w:t>
-      </w:r>
-      <w:r>
-        <w:rPr>
-          <w:color w:val="222222"/>
-        </w:rPr>
-        <w:t xml:space="preserve">You will need to make copies of some of the forms. The instructions below explain which forms you need for each step and how many copies to </w:t>
-      </w:r>
-      <w:proofErr w:type="gramStart"/>
-      <w:r>
-        <w:rPr>
-          <w:color w:val="222222"/>
-        </w:rPr>
-        <w:t>make.</w:t>
-      </w:r>
-      <w:r>
-        <w:rPr>
-          <w:color w:val="222222"/>
-        </w:rPr>
-        <w:t>{</w:t>
-      </w:r>
-      <w:proofErr w:type="gramEnd"/>
-      <w:r>
-        <w:rPr>
-          <w:color w:val="222222"/>
-        </w:rPr>
-        <w:t>% endif %}</w:t>
-      </w:r>
     </w:p>
     <w:p>
       <w:pPr>
@@ -649,62 +433,14 @@
         <w:rPr>
           <w:color w:val="222222"/>
         </w:rPr>
-        <w:t xml:space="preserve">{%p if </w:t>
-      </w:r>
-      <w:proofErr w:type="spellStart"/>
-      <w:r>
-        <w:rPr>
-          <w:color w:val="222222"/>
-        </w:rPr>
-        <w:t>county_choice</w:t>
-      </w:r>
-      <w:proofErr w:type="spellEnd"/>
-      <w:r>
-        <w:rPr>
-          <w:color w:val="222222"/>
-        </w:rPr>
-        <w:t xml:space="preserve"> </w:t>
-      </w:r>
-      <w:r>
-        <w:rPr>
-          <w:color w:val="222222"/>
-        </w:rPr>
-        <w:t>=</w:t>
-      </w:r>
-      <w:r>
-        <w:rPr>
-          <w:color w:val="222222"/>
-        </w:rPr>
-        <w:t>= “Oakland” %}</w:t>
-      </w:r>
-    </w:p>
-    <w:p>
-      <w:pPr>
-        <w:spacing w:after="0"/>
-        <w:rPr>
-          <w:color w:val="222222"/>
-        </w:rPr>
-      </w:pPr>
-      <w:r>
-        <w:rPr>
-          <w:color w:val="222222"/>
-        </w:rPr>
         <w:t xml:space="preserve">In Oakland County, you will e-file your forms on the </w:t>
       </w:r>
       <w:hyperlink r:id="rId8" w:history="1">
-        <w:proofErr w:type="spellStart"/>
         <w:r>
           <w:rPr>
             <w:rStyle w:val="Hyperlink"/>
           </w:rPr>
-          <w:t>MiFILE</w:t>
-        </w:r>
-        <w:proofErr w:type="spellEnd"/>
-        <w:r>
-          <w:rPr>
-            <w:rStyle w:val="Hyperlink"/>
-          </w:rPr>
-          <w:t xml:space="preserve"> website</w:t>
+          <w:t>MiFILE website</w:t>
         </w:r>
       </w:hyperlink>
       <w:r>
@@ -798,17 +534,8 @@
           <w:color w:val="222222"/>
           <w:highlight w:val="white"/>
         </w:rPr>
-        <w:t xml:space="preserve">E-filing using </w:t>
-      </w:r>
-      <w:proofErr w:type="spellStart"/>
-      <w:r>
-        <w:rPr>
-          <w:color w:val="222222"/>
-          <w:highlight w:val="white"/>
-        </w:rPr>
-        <w:t>MiFILE</w:t>
-      </w:r>
-      <w:proofErr w:type="spellEnd"/>
+        <w:t>E-filing using MiFILE</w:t>
+      </w:r>
     </w:p>
     <w:p>
       <w:pPr>
@@ -870,7 +597,6 @@
         </w:rPr>
       </w:pPr>
       <w:hyperlink r:id="rId10">
-        <w:proofErr w:type="spellStart"/>
         <w:r>
           <w:rPr>
             <w:color w:val="1155CC"/>
@@ -879,7 +605,6 @@
           </w:rPr>
           <w:t>MiFILE</w:t>
         </w:r>
-        <w:proofErr w:type="spellEnd"/>
       </w:hyperlink>
       <w:r>
         <w:rPr>
@@ -1202,21 +927,7 @@
         <w:rPr>
           <w:color w:val="222222"/>
         </w:rPr>
-        <w:t xml:space="preserve">not </w:t>
-      </w:r>
-      <w:proofErr w:type="spellStart"/>
-      <w:r>
-        <w:rPr>
-          <w:color w:val="222222"/>
-        </w:rPr>
-        <w:t>create_counterclaim</w:t>
-      </w:r>
-      <w:proofErr w:type="spellEnd"/>
-      <w:r>
-        <w:rPr>
-          <w:color w:val="222222"/>
-        </w:rPr>
-        <w:t xml:space="preserve"> </w:t>
+        <w:t xml:space="preserve">not create_counterclaim </w:t>
       </w:r>
       <w:r>
         <w:rPr>
@@ -1228,63 +939,19 @@
         <w:rPr>
           <w:color w:val="222222"/>
         </w:rPr>
-        <w:t xml:space="preserve"> </w:t>
-      </w:r>
-      <w:proofErr w:type="spellStart"/>
-      <w:r>
-        <w:rPr>
-          <w:color w:val="222222"/>
-        </w:rPr>
-        <w:t>there_are_marital_children</w:t>
-      </w:r>
-      <w:proofErr w:type="spellEnd"/>
-      <w:r>
-        <w:rPr>
-          <w:color w:val="222222"/>
-        </w:rPr>
-        <w:t>) or (</w:t>
-      </w:r>
-      <w:proofErr w:type="spellStart"/>
-      <w:r>
-        <w:rPr>
-          <w:color w:val="222222"/>
-        </w:rPr>
-        <w:t>create_counterclaim</w:t>
-      </w:r>
-      <w:proofErr w:type="spellEnd"/>
-      <w:r>
-        <w:rPr>
-          <w:color w:val="222222"/>
-        </w:rPr>
-        <w:t xml:space="preserve"> and </w:t>
-      </w:r>
-      <w:proofErr w:type="spellStart"/>
-      <w:r>
-        <w:rPr>
-          <w:color w:val="222222"/>
-        </w:rPr>
-        <w:t>counterclaim_type</w:t>
-      </w:r>
-      <w:proofErr w:type="spellEnd"/>
-      <w:r>
-        <w:rPr>
-          <w:color w:val="222222"/>
-        </w:rPr>
-        <w:t xml:space="preserve"> == “</w:t>
-      </w:r>
-      <w:proofErr w:type="spellStart"/>
-      <w:r>
-        <w:rPr>
-          <w:color w:val="222222"/>
-        </w:rPr>
-        <w:t>with_children</w:t>
-      </w:r>
-      <w:proofErr w:type="spellEnd"/>
-      <w:r>
-        <w:rPr>
-          <w:color w:val="222222"/>
-        </w:rPr>
-        <w:t>”</w:t>
+        <w:t xml:space="preserve"> there_are_marital_children</w:t>
+      </w:r>
+      <w:r>
+        <w:rPr>
+          <w:color w:val="222222"/>
+        </w:rPr>
+        <w:t xml:space="preserve">) or (create_counterclaim and </w:t>
+      </w:r>
+      <w:r>
+        <w:rPr>
+          <w:color w:val="222222"/>
+        </w:rPr>
+        <w:t>counterclaim_type == “with_children”</w:t>
       </w:r>
       <w:r>
         <w:rPr>
@@ -1396,35 +1063,7 @@
         <w:rPr>
           <w:color w:val="222222"/>
         </w:rPr>
-        <w:t xml:space="preserve"> If the plaintiff served you with copies of these forms, that likely means they have filed them. You can also check with the court clerk’s office to see if the forms were </w:t>
-      </w:r>
-      <w:proofErr w:type="gramStart"/>
-      <w:r>
-        <w:rPr>
-          <w:color w:val="222222"/>
-        </w:rPr>
-        <w:t>filed, or</w:t>
-      </w:r>
-      <w:proofErr w:type="gramEnd"/>
-      <w:r>
-        <w:rPr>
-          <w:color w:val="222222"/>
-        </w:rPr>
-        <w:t xml:space="preserve"> check </w:t>
-      </w:r>
-      <w:proofErr w:type="spellStart"/>
-      <w:r>
-        <w:rPr>
-          <w:color w:val="222222"/>
-        </w:rPr>
-        <w:t>MiFILE</w:t>
-      </w:r>
-      <w:proofErr w:type="spellEnd"/>
-      <w:r>
-        <w:rPr>
-          <w:color w:val="222222"/>
-        </w:rPr>
-        <w:t xml:space="preserve"> if your case was e-filed.</w:t>
+        <w:t xml:space="preserve"> If the plaintiff served you with copies of these forms, that likely means they have filed them. You can also check with the court clerk’s office to see if the forms were filed, or check MiFILE if your case was e-filed.</w:t>
       </w:r>
     </w:p>
     <w:p>
@@ -1439,21 +1078,7 @@
           <w:color w:val="222222"/>
         </w:rPr>
         <w:lastRenderedPageBreak/>
-        <w:t xml:space="preserve">If you find that the plaintiff did not file these forms, sign the Application for IV-D Child Support Services and the Verified Statement created by the form tool. The Uniform Child Custody Jurisdiction Enforcement Act Affidavit </w:t>
-      </w:r>
-      <w:proofErr w:type="gramStart"/>
-      <w:r>
-        <w:rPr>
-          <w:color w:val="222222"/>
-        </w:rPr>
-        <w:t>has to</w:t>
-      </w:r>
-      <w:proofErr w:type="gramEnd"/>
-      <w:r>
-        <w:rPr>
-          <w:color w:val="222222"/>
-        </w:rPr>
-        <w:t xml:space="preserve"> be signed in front of a notary. There may be a fee for notarization. You may be able to get your document notarized at a bank or at the court clerk's office. Some copy and print shops also offer notary services for a fee. Contact the bank or other location to make sure that a notary will be available at the time you plan on going. </w:t>
+        <w:t xml:space="preserve">If you find that the plaintiff did not file these forms, sign the Application for IV-D Child Support Services and the Verified Statement created by the form tool. The Uniform Child Custody Jurisdiction Enforcement Act Affidavit has to be signed in front of a notary. There may be a fee for notarization. You may be able to get your document notarized at a bank or at the court clerk's office. Some copy and print shops also offer notary services for a fee. Contact the bank or other location to make sure that a notary will be available at the time you plan on going. </w:t>
       </w:r>
     </w:p>
     <w:p>
@@ -1510,19 +1135,11 @@
         </w:rPr>
         <w:t xml:space="preserve">{%p if </w:t>
       </w:r>
-      <w:proofErr w:type="spellStart"/>
-      <w:r>
-        <w:rPr>
-          <w:color w:val="222222"/>
-        </w:rPr>
-        <w:t>county_choice</w:t>
-      </w:r>
-      <w:proofErr w:type="spellEnd"/>
-      <w:r>
-        <w:rPr>
-          <w:color w:val="222222"/>
-        </w:rPr>
-        <w:t xml:space="preserve"> </w:t>
+      <w:r>
+        <w:rPr>
+          <w:color w:val="222222"/>
+        </w:rPr>
+        <w:t xml:space="preserve">county_choice </w:t>
       </w:r>
       <w:r>
         <w:rPr>
@@ -1583,25 +1200,7 @@
           <w:bCs/>
           <w:color w:val="222222"/>
         </w:rPr>
-        <w:t xml:space="preserve">{% if (not </w:t>
-      </w:r>
-      <w:proofErr w:type="spellStart"/>
-      <w:r>
-        <w:rPr>
-          <w:b/>
-          <w:bCs/>
-          <w:color w:val="222222"/>
-        </w:rPr>
-        <w:t>create_counterclaim</w:t>
-      </w:r>
-      <w:proofErr w:type="spellEnd"/>
-      <w:r>
-        <w:rPr>
-          <w:b/>
-          <w:bCs/>
-          <w:color w:val="222222"/>
-        </w:rPr>
-        <w:t xml:space="preserve"> and </w:t>
+        <w:t xml:space="preserve">{% if (not create_counterclaim and </w:t>
       </w:r>
       <w:r>
         <w:rPr>
@@ -1611,61 +1210,14 @@
         </w:rPr>
         <w:t xml:space="preserve">not </w:t>
       </w:r>
-      <w:proofErr w:type="spellStart"/>
-      <w:r>
-        <w:rPr>
-          <w:b/>
-          <w:bCs/>
-          <w:color w:val="222222"/>
-        </w:rPr>
-        <w:t>there_are_marital_children</w:t>
-      </w:r>
-      <w:proofErr w:type="spellEnd"/>
-      <w:r>
-        <w:rPr>
-          <w:b/>
-          <w:bCs/>
-          <w:color w:val="222222"/>
-        </w:rPr>
-        <w:t>) or (</w:t>
-      </w:r>
-      <w:proofErr w:type="spellStart"/>
-      <w:r>
-        <w:rPr>
-          <w:b/>
-          <w:bCs/>
-          <w:color w:val="222222"/>
-        </w:rPr>
-        <w:t>create_counterclaim</w:t>
-      </w:r>
-      <w:proofErr w:type="spellEnd"/>
-      <w:r>
-        <w:rPr>
-          <w:b/>
-          <w:bCs/>
-          <w:color w:val="222222"/>
-        </w:rPr>
-        <w:t xml:space="preserve"> and </w:t>
-      </w:r>
-      <w:proofErr w:type="spellStart"/>
-      <w:r>
-        <w:rPr>
-          <w:b/>
-          <w:bCs/>
-          <w:color w:val="222222"/>
-        </w:rPr>
-        <w:t>counterclaim_type</w:t>
-      </w:r>
-      <w:proofErr w:type="spellEnd"/>
-      <w:r>
-        <w:rPr>
-          <w:b/>
-          <w:bCs/>
-          <w:color w:val="222222"/>
-        </w:rPr>
-        <w:t xml:space="preserve"> == “</w:t>
-      </w:r>
-      <w:proofErr w:type="spellStart"/>
+      <w:r>
+        <w:rPr>
+          <w:b/>
+          <w:bCs/>
+          <w:color w:val="222222"/>
+        </w:rPr>
+        <w:t>there_are_marital_children) or (create_counterclaim and counterclaim_type == “</w:t>
+      </w:r>
       <w:r>
         <w:rPr>
           <w:b/>
@@ -1680,16 +1232,7 @@
           <w:bCs/>
           <w:color w:val="222222"/>
         </w:rPr>
-        <w:t>_children</w:t>
-      </w:r>
-      <w:proofErr w:type="spellEnd"/>
-      <w:r>
-        <w:rPr>
-          <w:b/>
-          <w:bCs/>
-          <w:color w:val="222222"/>
-        </w:rPr>
-        <w:t>”) %}</w:t>
+        <w:t>_children”) %}</w:t>
       </w:r>
       <w:r>
         <w:rPr>
@@ -1715,23 +1258,13 @@
         </w:rPr>
         <w:t xml:space="preserve"> else %}F{% endif %}</w:t>
       </w:r>
-      <w:proofErr w:type="spellStart"/>
-      <w:r>
-        <w:rPr>
-          <w:b/>
-          <w:bCs/>
-          <w:color w:val="222222"/>
-        </w:rPr>
-        <w:t>ind</w:t>
-      </w:r>
-      <w:proofErr w:type="spellEnd"/>
-      <w:r>
-        <w:rPr>
-          <w:b/>
-          <w:bCs/>
-          <w:color w:val="222222"/>
-        </w:rPr>
-        <w:t xml:space="preserve"> out if you need Friend of the Court copies.</w:t>
+      <w:r>
+        <w:rPr>
+          <w:b/>
+          <w:bCs/>
+          <w:color w:val="222222"/>
+        </w:rPr>
+        <w:t>ind out if you need Friend of the Court copies.</w:t>
       </w:r>
       <w:r>
         <w:rPr>
@@ -1809,77 +1342,7 @@
         <w:rPr>
           <w:color w:val="222222"/>
         </w:rPr>
-        <w:t xml:space="preserve">(not </w:t>
-      </w:r>
-      <w:proofErr w:type="spellStart"/>
-      <w:r>
-        <w:rPr>
-          <w:color w:val="222222"/>
-        </w:rPr>
-        <w:t>create_counterclaim</w:t>
-      </w:r>
-      <w:proofErr w:type="spellEnd"/>
-      <w:r>
-        <w:rPr>
-          <w:color w:val="222222"/>
-        </w:rPr>
-        <w:t xml:space="preserve"> and not </w:t>
-      </w:r>
-      <w:proofErr w:type="spellStart"/>
-      <w:r>
-        <w:rPr>
-          <w:color w:val="222222"/>
-        </w:rPr>
-        <w:t>there_are_marital_children</w:t>
-      </w:r>
-      <w:proofErr w:type="spellEnd"/>
-      <w:r>
-        <w:rPr>
-          <w:color w:val="222222"/>
-        </w:rPr>
-        <w:t>) or (</w:t>
-      </w:r>
-      <w:proofErr w:type="spellStart"/>
-      <w:r>
-        <w:rPr>
-          <w:color w:val="222222"/>
-        </w:rPr>
-        <w:t>create_counterclaim</w:t>
-      </w:r>
-      <w:proofErr w:type="spellEnd"/>
-      <w:r>
-        <w:rPr>
-          <w:color w:val="222222"/>
-        </w:rPr>
-        <w:t xml:space="preserve"> and </w:t>
-      </w:r>
-      <w:proofErr w:type="spellStart"/>
-      <w:r>
-        <w:rPr>
-          <w:color w:val="222222"/>
-        </w:rPr>
-        <w:t>counterclaim_type</w:t>
-      </w:r>
-      <w:proofErr w:type="spellEnd"/>
-      <w:r>
-        <w:rPr>
-          <w:color w:val="222222"/>
-        </w:rPr>
-        <w:t xml:space="preserve"> == “</w:t>
-      </w:r>
-      <w:proofErr w:type="spellStart"/>
-      <w:r>
-        <w:rPr>
-          <w:color w:val="222222"/>
-        </w:rPr>
-        <w:t>no_children</w:t>
-      </w:r>
-      <w:proofErr w:type="spellEnd"/>
-      <w:r>
-        <w:rPr>
-          <w:color w:val="222222"/>
-        </w:rPr>
-        <w:t>”) %}</w:t>
+        <w:t>(not create_counterclaim and not there_are_marital_children) or (create_counterclaim and counterclaim_type == “no_children”) %}</w:t>
       </w:r>
     </w:p>
     <w:p>
@@ -2188,21 +1651,7 @@
         <w:rPr>
           <w:color w:val="222222"/>
         </w:rPr>
-        <w:t xml:space="preserve">{%p if </w:t>
-      </w:r>
-      <w:proofErr w:type="spellStart"/>
-      <w:r>
-        <w:rPr>
-          <w:color w:val="222222"/>
-        </w:rPr>
-        <w:t>county_choice</w:t>
-      </w:r>
-      <w:proofErr w:type="spellEnd"/>
-      <w:r>
-        <w:rPr>
-          <w:color w:val="222222"/>
-        </w:rPr>
-        <w:t xml:space="preserve"> == “Oakland” %}</w:t>
+        <w:t>{%p if county_choice == “Oakland” %}</w:t>
       </w:r>
     </w:p>
     <w:p>
@@ -2257,7 +1706,6 @@
         <w:t xml:space="preserve">Upload your documents in </w:t>
       </w:r>
       <w:hyperlink r:id="rId14">
-        <w:proofErr w:type="spellStart"/>
         <w:r>
           <w:rPr>
             <w:b/>
@@ -2267,7 +1715,6 @@
           </w:rPr>
           <w:t>MiFILE</w:t>
         </w:r>
-        <w:proofErr w:type="spellEnd"/>
       </w:hyperlink>
       <w:r>
         <w:rPr>
@@ -2275,43 +1722,7 @@
           <w:color w:val="222222"/>
           <w:highlight w:val="white"/>
         </w:rPr>
-        <w:t xml:space="preserve">. Within </w:t>
-      </w:r>
-      <w:proofErr w:type="spellStart"/>
-      <w:r>
-        <w:rPr>
-          <w:b/>
-          <w:color w:val="222222"/>
-          <w:highlight w:val="white"/>
-        </w:rPr>
-        <w:t>MiFILE</w:t>
-      </w:r>
-      <w:proofErr w:type="spellEnd"/>
-      <w:r>
-        <w:rPr>
-          <w:b/>
-          <w:color w:val="222222"/>
-          <w:highlight w:val="white"/>
-        </w:rPr>
-        <w:t xml:space="preserve">, you will need to choose a </w:t>
-      </w:r>
-      <w:proofErr w:type="gramStart"/>
-      <w:r>
-        <w:rPr>
-          <w:b/>
-          <w:color w:val="222222"/>
-          <w:highlight w:val="white"/>
-        </w:rPr>
-        <w:t>drop down</w:t>
-      </w:r>
-      <w:proofErr w:type="gramEnd"/>
-      <w:r>
-        <w:rPr>
-          <w:b/>
-          <w:color w:val="222222"/>
-          <w:highlight w:val="white"/>
-        </w:rPr>
-        <w:t xml:space="preserve"> label for each individual document you upload. </w:t>
+        <w:t xml:space="preserve">. Within MiFILE, you will need to choose a drop down label for each individual document you upload. </w:t>
       </w:r>
     </w:p>
     <w:p>
@@ -2361,77 +1772,7 @@
         <w:rPr>
           <w:color w:val="1B1B1B"/>
         </w:rPr>
-        <w:t xml:space="preserve">{%p if (not </w:t>
-      </w:r>
-      <w:proofErr w:type="spellStart"/>
-      <w:r>
-        <w:rPr>
-          <w:color w:val="1B1B1B"/>
-        </w:rPr>
-        <w:t>create_counterclaim</w:t>
-      </w:r>
-      <w:proofErr w:type="spellEnd"/>
-      <w:r>
-        <w:rPr>
-          <w:color w:val="1B1B1B"/>
-        </w:rPr>
-        <w:t xml:space="preserve"> and not </w:t>
-      </w:r>
-      <w:proofErr w:type="spellStart"/>
-      <w:r>
-        <w:rPr>
-          <w:color w:val="1B1B1B"/>
-        </w:rPr>
-        <w:t>there_are_marital_children</w:t>
-      </w:r>
-      <w:proofErr w:type="spellEnd"/>
-      <w:r>
-        <w:rPr>
-          <w:color w:val="1B1B1B"/>
-        </w:rPr>
-        <w:t>) or (</w:t>
-      </w:r>
-      <w:proofErr w:type="spellStart"/>
-      <w:r>
-        <w:rPr>
-          <w:color w:val="1B1B1B"/>
-        </w:rPr>
-        <w:t>create_counterclaim</w:t>
-      </w:r>
-      <w:proofErr w:type="spellEnd"/>
-      <w:r>
-        <w:rPr>
-          <w:color w:val="1B1B1B"/>
-        </w:rPr>
-        <w:t xml:space="preserve"> and </w:t>
-      </w:r>
-      <w:proofErr w:type="spellStart"/>
-      <w:r>
-        <w:rPr>
-          <w:color w:val="1B1B1B"/>
-        </w:rPr>
-        <w:t>counterclaim_type</w:t>
-      </w:r>
-      <w:proofErr w:type="spellEnd"/>
-      <w:r>
-        <w:rPr>
-          <w:color w:val="1B1B1B"/>
-        </w:rPr>
-        <w:t xml:space="preserve"> == “</w:t>
-      </w:r>
-      <w:proofErr w:type="spellStart"/>
-      <w:r>
-        <w:rPr>
-          <w:color w:val="1B1B1B"/>
-        </w:rPr>
-        <w:t>no_children</w:t>
-      </w:r>
-      <w:proofErr w:type="spellEnd"/>
-      <w:r>
-        <w:rPr>
-          <w:color w:val="1B1B1B"/>
-        </w:rPr>
-        <w:t>”) %}</w:t>
+        <w:t>{%p if (not create_counterclaim and not there_are_marital_children) or (create_counterclaim and counterclaim_type == “no_children”) %}</w:t>
       </w:r>
     </w:p>
     <w:p>
@@ -2770,77 +2111,7 @@
         <w:rPr>
           <w:color w:val="1B1B1B"/>
         </w:rPr>
-        <w:t xml:space="preserve">{%p if (not </w:t>
-      </w:r>
-      <w:proofErr w:type="spellStart"/>
-      <w:r>
-        <w:rPr>
-          <w:color w:val="1B1B1B"/>
-        </w:rPr>
-        <w:t>create_counterclaim</w:t>
-      </w:r>
-      <w:proofErr w:type="spellEnd"/>
-      <w:r>
-        <w:rPr>
-          <w:color w:val="1B1B1B"/>
-        </w:rPr>
-        <w:t xml:space="preserve"> and not </w:t>
-      </w:r>
-      <w:proofErr w:type="spellStart"/>
-      <w:r>
-        <w:rPr>
-          <w:color w:val="1B1B1B"/>
-        </w:rPr>
-        <w:t>there_are_marital_children</w:t>
-      </w:r>
-      <w:proofErr w:type="spellEnd"/>
-      <w:r>
-        <w:rPr>
-          <w:color w:val="1B1B1B"/>
-        </w:rPr>
-        <w:t>) or (</w:t>
-      </w:r>
-      <w:proofErr w:type="spellStart"/>
-      <w:r>
-        <w:rPr>
-          <w:color w:val="1B1B1B"/>
-        </w:rPr>
-        <w:t>create_counterclaim</w:t>
-      </w:r>
-      <w:proofErr w:type="spellEnd"/>
-      <w:r>
-        <w:rPr>
-          <w:color w:val="1B1B1B"/>
-        </w:rPr>
-        <w:t xml:space="preserve"> and </w:t>
-      </w:r>
-      <w:proofErr w:type="spellStart"/>
-      <w:r>
-        <w:rPr>
-          <w:color w:val="1B1B1B"/>
-        </w:rPr>
-        <w:t>counterclaim_type</w:t>
-      </w:r>
-      <w:proofErr w:type="spellEnd"/>
-      <w:r>
-        <w:rPr>
-          <w:color w:val="1B1B1B"/>
-        </w:rPr>
-        <w:t xml:space="preserve"> == “</w:t>
-      </w:r>
-      <w:proofErr w:type="spellStart"/>
-      <w:r>
-        <w:rPr>
-          <w:color w:val="1B1B1B"/>
-        </w:rPr>
-        <w:t>no_children</w:t>
-      </w:r>
-      <w:proofErr w:type="spellEnd"/>
-      <w:r>
-        <w:rPr>
-          <w:color w:val="1B1B1B"/>
-        </w:rPr>
-        <w:t>”) %}</w:t>
+        <w:t>{%p if (not create_counterclaim and not there_are_marital_children) or (create_counterclaim and counterclaim_type == “no_children”) %}</w:t>
       </w:r>
     </w:p>
     <w:p>
@@ -3192,77 +2463,7 @@
         <w:rPr>
           <w:color w:val="1B1B1B"/>
         </w:rPr>
-        <w:t xml:space="preserve">{%p if (not </w:t>
-      </w:r>
-      <w:proofErr w:type="spellStart"/>
-      <w:r>
-        <w:rPr>
-          <w:color w:val="1B1B1B"/>
-        </w:rPr>
-        <w:t>create_counterclaim</w:t>
-      </w:r>
-      <w:proofErr w:type="spellEnd"/>
-      <w:r>
-        <w:rPr>
-          <w:color w:val="1B1B1B"/>
-        </w:rPr>
-        <w:t xml:space="preserve"> and not </w:t>
-      </w:r>
-      <w:proofErr w:type="spellStart"/>
-      <w:r>
-        <w:rPr>
-          <w:color w:val="1B1B1B"/>
-        </w:rPr>
-        <w:t>there_are_marital_children</w:t>
-      </w:r>
-      <w:proofErr w:type="spellEnd"/>
-      <w:r>
-        <w:rPr>
-          <w:color w:val="1B1B1B"/>
-        </w:rPr>
-        <w:t>) or (</w:t>
-      </w:r>
-      <w:proofErr w:type="spellStart"/>
-      <w:r>
-        <w:rPr>
-          <w:color w:val="1B1B1B"/>
-        </w:rPr>
-        <w:t>create_counterclaim</w:t>
-      </w:r>
-      <w:proofErr w:type="spellEnd"/>
-      <w:r>
-        <w:rPr>
-          <w:color w:val="1B1B1B"/>
-        </w:rPr>
-        <w:t xml:space="preserve"> and </w:t>
-      </w:r>
-      <w:proofErr w:type="spellStart"/>
-      <w:r>
-        <w:rPr>
-          <w:color w:val="1B1B1B"/>
-        </w:rPr>
-        <w:t>counterclaim_type</w:t>
-      </w:r>
-      <w:proofErr w:type="spellEnd"/>
-      <w:r>
-        <w:rPr>
-          <w:color w:val="1B1B1B"/>
-        </w:rPr>
-        <w:t xml:space="preserve"> == “</w:t>
-      </w:r>
-      <w:proofErr w:type="spellStart"/>
-      <w:r>
-        <w:rPr>
-          <w:color w:val="1B1B1B"/>
-        </w:rPr>
-        <w:t>no_children</w:t>
-      </w:r>
-      <w:proofErr w:type="spellEnd"/>
-      <w:r>
-        <w:rPr>
-          <w:color w:val="1B1B1B"/>
-        </w:rPr>
-        <w:t>”) %}</w:t>
+        <w:t>{%p if (not create_counterclaim and not there_are_marital_children) or (create_counterclaim and counterclaim_type == “no_children”) %}</w:t>
       </w:r>
     </w:p>
     <w:p>
@@ -3346,63 +2547,7 @@
         <w:rPr>
           <w:color w:val="222222"/>
         </w:rPr>
-        <w:t xml:space="preserve">If you used </w:t>
-      </w:r>
-      <w:proofErr w:type="spellStart"/>
-      <w:r>
-        <w:rPr>
-          <w:color w:val="222222"/>
-        </w:rPr>
-        <w:t>MiFILE</w:t>
-      </w:r>
-      <w:proofErr w:type="spellEnd"/>
-      <w:r>
-        <w:rPr>
-          <w:color w:val="222222"/>
-        </w:rPr>
-        <w:t xml:space="preserve"> to file documents electronically, </w:t>
-      </w:r>
-      <w:proofErr w:type="spellStart"/>
-      <w:r>
-        <w:rPr>
-          <w:color w:val="222222"/>
-        </w:rPr>
-        <w:t>MiFILE</w:t>
-      </w:r>
-      <w:proofErr w:type="spellEnd"/>
-      <w:r>
-        <w:rPr>
-          <w:color w:val="222222"/>
-        </w:rPr>
-        <w:t xml:space="preserve"> will also serve the documents electronically if the other party is using </w:t>
-      </w:r>
-      <w:proofErr w:type="spellStart"/>
-      <w:r>
-        <w:rPr>
-          <w:color w:val="222222"/>
-        </w:rPr>
-        <w:t>MiFILE</w:t>
-      </w:r>
-      <w:proofErr w:type="spellEnd"/>
-      <w:r>
-        <w:rPr>
-          <w:color w:val="222222"/>
-        </w:rPr>
-        <w:t xml:space="preserve">. If you are not both using </w:t>
-      </w:r>
-      <w:proofErr w:type="spellStart"/>
-      <w:r>
-        <w:rPr>
-          <w:color w:val="222222"/>
-        </w:rPr>
-        <w:t>MiFILE</w:t>
-      </w:r>
-      <w:proofErr w:type="spellEnd"/>
-      <w:r>
-        <w:rPr>
-          <w:color w:val="222222"/>
-        </w:rPr>
-        <w:t xml:space="preserve">, you will need to serve the documents by e-mail, if possible. If you or the other party can't do this, or if you are not sure, you can serve by regular mail or personal delivery. If you serve by mail, send the papers to the other party’s last known address. </w:t>
+        <w:t xml:space="preserve">If you used MiFILE to file documents electronically, MiFILE will also serve the documents electronically if the other party is using MiFILE. If you are not both using MiFILE, you will need to serve the documents by e-mail, if possible. If you or the other party can't do this, or if you are not sure, you can serve by regular mail or personal delivery. If you serve by mail, send the papers to the other party’s last known address. </w:t>
       </w:r>
     </w:p>
     <w:p>
@@ -3543,39 +2688,7 @@
           <w:color w:val="222222"/>
           <w:highlight w:val="white"/>
         </w:rPr>
-        <w:t xml:space="preserve">If you served the other party using </w:t>
-      </w:r>
-      <w:proofErr w:type="spellStart"/>
-      <w:r>
-        <w:rPr>
-          <w:color w:val="222222"/>
-          <w:highlight w:val="white"/>
-        </w:rPr>
-        <w:t>MiFILE</w:t>
-      </w:r>
-      <w:proofErr w:type="spellEnd"/>
-      <w:r>
-        <w:rPr>
-          <w:color w:val="222222"/>
-          <w:highlight w:val="white"/>
-        </w:rPr>
-        <w:t xml:space="preserve">, you will not need to file a Proof of Service. </w:t>
-      </w:r>
-      <w:proofErr w:type="spellStart"/>
-      <w:r>
-        <w:rPr>
-          <w:color w:val="222222"/>
-          <w:highlight w:val="white"/>
-        </w:rPr>
-        <w:t>MiFILE</w:t>
-      </w:r>
-      <w:proofErr w:type="spellEnd"/>
-      <w:r>
-        <w:rPr>
-          <w:color w:val="222222"/>
-          <w:highlight w:val="white"/>
-        </w:rPr>
-        <w:t xml:space="preserve"> will create and file a Proof of Service for you.</w:t>
+        <w:t>If you served the other party using MiFILE, you will not need to file a Proof of Service. MiFILE will create and file a Proof of Service for you.</w:t>
       </w:r>
     </w:p>
     <w:p>
@@ -3606,21 +2719,7 @@
           <w:color w:val="222222"/>
           <w:highlight w:val="white"/>
         </w:rPr>
-        <w:t>. Fill in the date of service and who you served (</w:t>
-      </w:r>
-      <w:r>
-        <w:rPr>
-          <w:color w:val="222222"/>
-          <w:highlight w:val="white"/>
-        </w:rPr>
-        <w:t>your spouse</w:t>
-      </w:r>
-      <w:r>
-        <w:rPr>
-          <w:color w:val="222222"/>
-          <w:highlight w:val="white"/>
-        </w:rPr>
-        <w:t xml:space="preserve"> or their attorney). Check the boxes next to the names of the forms you served and indicate which method of service you used. Date and sign the Proof of Service and file it</w:t>
+        <w:t>. Fill in the date of service and who you served (the plaintiff or their attorney). Check the boxes next to the names of the forms you served and indicate which method of service you used. Date and sign the Proof of Service and file it</w:t>
       </w:r>
       <w:r>
         <w:rPr>
@@ -3635,23 +2734,44 @@
         <w:rPr>
           <w:color w:val="222222"/>
         </w:rPr>
+        <w:t xml:space="preserve">{% if county_choice </w:t>
+      </w:r>
+      <w:r>
+        <w:rPr>
+          <w:color w:val="222222"/>
+        </w:rPr>
+        <w:t>!</w:t>
+      </w:r>
+      <w:r>
+        <w:rPr>
+          <w:color w:val="222222"/>
+        </w:rPr>
+        <w:t>= “Oakland” %}</w:t>
+      </w:r>
+      <w:r>
+        <w:rPr>
+          <w:color w:val="222222"/>
+        </w:rPr>
         <w:t xml:space="preserve">{% if </w:t>
       </w:r>
-      <w:proofErr w:type="spellStart"/>
-      <w:r>
-        <w:rPr>
-          <w:color w:val="222222"/>
-        </w:rPr>
-        <w:t>county_</w:t>
-      </w:r>
-      <w:proofErr w:type="gramStart"/>
-      <w:r>
-        <w:rPr>
-          <w:color w:val="222222"/>
-        </w:rPr>
-        <w:t>choice</w:t>
-      </w:r>
-      <w:proofErr w:type="spellEnd"/>
+      <w:r>
+        <w:rPr>
+          <w:color w:val="222222"/>
+        </w:rPr>
+        <w:t>(not create_counterclaim and there_are_marital_children) or (create_counterclaim and counterclaim_type == “</w:t>
+      </w:r>
+      <w:r>
+        <w:rPr>
+          <w:color w:val="222222"/>
+        </w:rPr>
+        <w:t>with</w:t>
+      </w:r>
+      <w:r>
+        <w:rPr>
+          <w:color w:val="222222"/>
+        </w:rPr>
+        <w:t>_children”) %}</w:t>
+      </w:r>
       <w:r>
         <w:rPr>
           <w:color w:val="222222"/>
@@ -3662,177 +2782,42 @@
         <w:rPr>
           <w:color w:val="222222"/>
         </w:rPr>
-        <w:t>!</w:t>
-      </w:r>
-      <w:proofErr w:type="gramEnd"/>
-      <w:r>
-        <w:rPr>
-          <w:color w:val="222222"/>
-        </w:rPr>
-        <w:t xml:space="preserve">= “Oakland” </w:t>
-      </w:r>
-      <w:proofErr w:type="gramStart"/>
-      <w:r>
-        <w:rPr>
-          <w:color w:val="222222"/>
-        </w:rPr>
-        <w:t>%}</w:t>
-      </w:r>
-      <w:r>
-        <w:rPr>
-          <w:color w:val="222222"/>
-        </w:rPr>
-        <w:t>{</w:t>
-      </w:r>
-      <w:proofErr w:type="gramEnd"/>
-      <w:r>
-        <w:rPr>
-          <w:color w:val="222222"/>
-        </w:rPr>
-        <w:t xml:space="preserve">% if </w:t>
-      </w:r>
-      <w:r>
-        <w:rPr>
-          <w:color w:val="222222"/>
-        </w:rPr>
-        <w:t xml:space="preserve">(not </w:t>
-      </w:r>
-      <w:proofErr w:type="spellStart"/>
-      <w:r>
-        <w:rPr>
-          <w:color w:val="222222"/>
-        </w:rPr>
-        <w:t>create_counterclaim</w:t>
-      </w:r>
-      <w:proofErr w:type="spellEnd"/>
-      <w:r>
-        <w:rPr>
-          <w:color w:val="222222"/>
-        </w:rPr>
-        <w:t xml:space="preserve"> and </w:t>
-      </w:r>
-      <w:proofErr w:type="spellStart"/>
-      <w:r>
-        <w:rPr>
-          <w:color w:val="222222"/>
-        </w:rPr>
-        <w:t>there_are_marital_children</w:t>
-      </w:r>
-      <w:proofErr w:type="spellEnd"/>
-      <w:r>
-        <w:rPr>
-          <w:color w:val="222222"/>
-        </w:rPr>
-        <w:t>) or (</w:t>
-      </w:r>
-      <w:proofErr w:type="spellStart"/>
-      <w:r>
-        <w:rPr>
-          <w:color w:val="222222"/>
-        </w:rPr>
-        <w:t>create_counterclaim</w:t>
-      </w:r>
-      <w:proofErr w:type="spellEnd"/>
-      <w:r>
-        <w:rPr>
-          <w:color w:val="222222"/>
-        </w:rPr>
-        <w:t xml:space="preserve"> and </w:t>
-      </w:r>
-      <w:proofErr w:type="spellStart"/>
-      <w:r>
-        <w:rPr>
-          <w:color w:val="222222"/>
-        </w:rPr>
-        <w:t>counterclaim_type</w:t>
-      </w:r>
-      <w:proofErr w:type="spellEnd"/>
-      <w:r>
-        <w:rPr>
-          <w:color w:val="222222"/>
-        </w:rPr>
-        <w:t xml:space="preserve"> == “</w:t>
-      </w:r>
-      <w:proofErr w:type="spellStart"/>
-      <w:r>
-        <w:rPr>
-          <w:color w:val="222222"/>
-        </w:rPr>
-        <w:t>with</w:t>
-      </w:r>
-      <w:r>
-        <w:rPr>
-          <w:color w:val="222222"/>
-        </w:rPr>
-        <w:t>_children</w:t>
-      </w:r>
-      <w:proofErr w:type="spellEnd"/>
-      <w:r>
-        <w:rPr>
-          <w:color w:val="222222"/>
-        </w:rPr>
-        <w:t>”) %}</w:t>
-      </w:r>
-      <w:r>
-        <w:rPr>
-          <w:color w:val="222222"/>
-        </w:rPr>
+        <w:t>If you are filing in person, also file an extra copy for the Friend of the Court</w:t>
+      </w:r>
+      <w:r>
         <w:t xml:space="preserve"> </w:t>
       </w:r>
       <w:r>
         <w:rPr>
           <w:color w:val="222222"/>
         </w:rPr>
-        <w:t>If you are filing in person, also file an extra copy for the Friend of the Court</w:t>
-      </w:r>
-      <w:r>
+        <w:t>if your court requires FOC copies</w:t>
+      </w:r>
+      <w:r>
+        <w:rPr>
+          <w:color w:val="222222"/>
+        </w:rPr>
+        <w:t>, and make a copy for your records.{% else %}</w:t>
+      </w:r>
+      <w:r>
+        <w:rPr>
+          <w:color w:val="222222"/>
+        </w:rPr>
         <w:t xml:space="preserve"> </w:t>
       </w:r>
       <w:r>
         <w:rPr>
           <w:color w:val="222222"/>
-        </w:rPr>
-        <w:t>if your court requires FOC copies</w:t>
-      </w:r>
-      <w:r>
-        <w:rPr>
-          <w:color w:val="222222"/>
-        </w:rPr>
-        <w:t xml:space="preserve">, and make a copy for your </w:t>
-      </w:r>
-      <w:proofErr w:type="gramStart"/>
-      <w:r>
-        <w:rPr>
-          <w:color w:val="222222"/>
-        </w:rPr>
-        <w:t>records.{</w:t>
-      </w:r>
-      <w:proofErr w:type="gramEnd"/>
-      <w:r>
-        <w:rPr>
-          <w:color w:val="222222"/>
-        </w:rPr>
-        <w:t>% else %}</w:t>
-      </w:r>
-      <w:r>
-        <w:rPr>
-          <w:color w:val="222222"/>
-        </w:rPr>
+          <w:highlight w:val="white"/>
+        </w:rPr>
+        <w:t>If you are filing in person,</w:t>
+      </w:r>
+      <w:r>
         <w:t xml:space="preserve"> </w:t>
       </w:r>
       <w:r>
         <w:rPr>
           <w:color w:val="222222"/>
-          <w:highlight w:val="white"/>
-        </w:rPr>
-        <w:t>If you are filing in person,</w:t>
-      </w:r>
-      <w:r>
-        <w:t xml:space="preserve"> </w:t>
-      </w:r>
-      <w:r>
-        <w:rPr>
-          <w:color w:val="222222"/>
         </w:rPr>
         <w:t xml:space="preserve">also file an extra copy for the Friend of the Court if you or your spouse requested spousal support </w:t>
       </w:r>
@@ -3870,30 +2855,14 @@
           <w:color w:val="222222"/>
           <w:highlight w:val="white"/>
         </w:rPr>
-        <w:t xml:space="preserve">{% endif </w:t>
-      </w:r>
-      <w:proofErr w:type="gramStart"/>
-      <w:r>
-        <w:rPr>
-          <w:color w:val="222222"/>
-          <w:highlight w:val="white"/>
-        </w:rPr>
-        <w:t>%}</w:t>
-      </w:r>
-      <w:r>
-        <w:rPr>
-          <w:color w:val="222222"/>
-          <w:highlight w:val="white"/>
-        </w:rPr>
-        <w:t>{</w:t>
-      </w:r>
-      <w:proofErr w:type="gramEnd"/>
-      <w:r>
-        <w:rPr>
-          <w:color w:val="222222"/>
-          <w:highlight w:val="white"/>
-        </w:rPr>
-        <w:t>% endif %}</w:t>
+        <w:t>{% endif %}</w:t>
+      </w:r>
+      <w:r>
+        <w:rPr>
+          <w:color w:val="222222"/>
+          <w:highlight w:val="white"/>
+        </w:rPr>
+        <w:t>{% endif %}</w:t>
       </w:r>
       <w:r>
         <w:rPr>
@@ -4034,23 +3003,7 @@
           <w:bCs/>
           <w:color w:val="222222"/>
         </w:rPr>
-        <w:t xml:space="preserve">Within 28 days after you serve </w:t>
-      </w:r>
-      <w:r>
-        <w:rPr>
-          <w:b/>
-          <w:bCs/>
-          <w:color w:val="222222"/>
-        </w:rPr>
-        <w:t>your spouse</w:t>
-      </w:r>
-      <w:r>
-        <w:rPr>
-          <w:b/>
-          <w:bCs/>
-          <w:color w:val="222222"/>
-        </w:rPr>
-        <w:t xml:space="preserve"> with your Answer, </w:t>
+        <w:t xml:space="preserve">Within 28 days after you serve the plaintiff with your Answer, </w:t>
       </w:r>
     </w:p>
     <w:p>
@@ -4198,33 +3151,7 @@
         <w:rPr>
           <w:color w:val="222222"/>
         </w:rPr>
-        <w:t xml:space="preserve"> at the first scheduled hearing instead of mailing it, unless you and </w:t>
-      </w:r>
-      <w:r>
-        <w:rPr>
-          <w:color w:val="222222"/>
-        </w:rPr>
-        <w:t>your spouse</w:t>
-      </w:r>
-      <w:r>
-        <w:rPr>
-          <w:color w:val="222222"/>
-        </w:rPr>
-        <w:t xml:space="preserve"> agree otherwise or the court directs otherwise. If you leave out information, you must explain the reasons why in </w:t>
-      </w:r>
-      <w:proofErr w:type="gramStart"/>
-      <w:r>
-        <w:rPr>
-          <w:color w:val="222222"/>
-        </w:rPr>
-        <w:t>a sworn affidavit</w:t>
-      </w:r>
-      <w:proofErr w:type="gramEnd"/>
-      <w:r>
-        <w:rPr>
-          <w:color w:val="222222"/>
-        </w:rPr>
-        <w:t xml:space="preserve"> and file it with the court within 28 days after you serve the Answer.</w:t>
+        <w:t xml:space="preserve"> at the first scheduled hearing instead of mailing it, unless you and the plaintiff agree otherwise or the court directs otherwise. If you leave out information, you must explain the reasons why in a sworn affidavit and file it with the court within 28 days after you serve the Answer.</w:t>
       </w:r>
     </w:p>
     <w:p>
@@ -4361,47 +3288,19 @@
         <w:rPr>
           <w:color w:val="222222"/>
         </w:rPr>
-        <w:t xml:space="preserve"> after serving the form. If you served by e-mail, cross out “first-class mail” and write "e-mail." In the space for the other party's address, write the e-mail address </w:t>
-      </w:r>
-      <w:proofErr w:type="gramStart"/>
-      <w:r>
-        <w:rPr>
-          <w:color w:val="222222"/>
-        </w:rPr>
-        <w:t>instead.</w:t>
-      </w:r>
-      <w:r>
-        <w:rPr>
-          <w:color w:val="222222"/>
-        </w:rPr>
-        <w:t>{</w:t>
-      </w:r>
-      <w:proofErr w:type="gramEnd"/>
-      <w:r>
-        <w:rPr>
-          <w:color w:val="222222"/>
-        </w:rPr>
-        <w:t xml:space="preserve">% </w:t>
-      </w:r>
-      <w:r>
-        <w:rPr>
-          <w:color w:val="222222"/>
-        </w:rPr>
-        <w:t xml:space="preserve">if </w:t>
-      </w:r>
-      <w:proofErr w:type="spellStart"/>
-      <w:r>
-        <w:rPr>
-          <w:color w:val="222222"/>
-        </w:rPr>
-        <w:t>county_choice</w:t>
-      </w:r>
-      <w:proofErr w:type="spellEnd"/>
-      <w:r>
-        <w:rPr>
-          <w:color w:val="222222"/>
-        </w:rPr>
-        <w:t xml:space="preserve"> == “Oakland” %}</w:t>
+        <w:t xml:space="preserve"> after serving the form. If you served by e-mail, cross out “first-class mail” and write "e-mail." In the space for the other party's address, write the e-mail address instead.</w:t>
+      </w:r>
+      <w:r>
+        <w:rPr>
+          <w:color w:val="222222"/>
+        </w:rPr>
+        <w:t xml:space="preserve">{% </w:t>
+      </w:r>
+      <w:r>
+        <w:rPr>
+          <w:color w:val="222222"/>
+        </w:rPr>
+        <w:t>if county_choice == “Oakland” %}</w:t>
       </w:r>
       <w:r>
         <w:rPr>
@@ -4413,35 +3312,13 @@
         <w:rPr>
           <w:color w:val="222222"/>
         </w:rPr>
-        <w:t xml:space="preserve">File the Proof of Mailing in </w:t>
-      </w:r>
-      <w:proofErr w:type="spellStart"/>
-      <w:proofErr w:type="gramStart"/>
-      <w:r>
-        <w:rPr>
-          <w:color w:val="222222"/>
-        </w:rPr>
-        <w:t>MiFILE</w:t>
-      </w:r>
-      <w:proofErr w:type="spellEnd"/>
-      <w:r>
-        <w:rPr>
-          <w:color w:val="222222"/>
-        </w:rPr>
-        <w:t>.</w:t>
-      </w:r>
-      <w:r>
-        <w:rPr>
-          <w:color w:val="222222"/>
-        </w:rPr>
-        <w:t>{</w:t>
-      </w:r>
-      <w:proofErr w:type="gramEnd"/>
-      <w:r>
-        <w:rPr>
-          <w:color w:val="222222"/>
-        </w:rPr>
-        <w:t>% else %}</w:t>
+        <w:t>File the Proof of Mailing in MiFILE.</w:t>
+      </w:r>
+      <w:r>
+        <w:rPr>
+          <w:color w:val="222222"/>
+        </w:rPr>
+        <w:t>{% else %}</w:t>
       </w:r>
       <w:r>
         <w:rPr>
@@ -4453,27 +3330,13 @@
         <w:rPr>
           <w:color w:val="222222"/>
         </w:rPr>
-        <w:t xml:space="preserve">If you are filing in person at the court clerk's office, also file a copy of the Proof of Mailing for the Friend of the Court if your court requires FOC copies. Get a copy of the Proof of Mailing for your </w:t>
-      </w:r>
-      <w:proofErr w:type="gramStart"/>
-      <w:r>
-        <w:rPr>
-          <w:color w:val="222222"/>
-        </w:rPr>
-        <w:t>records.</w:t>
-      </w:r>
-      <w:r>
-        <w:rPr>
-          <w:color w:val="222222"/>
-        </w:rPr>
-        <w:t>{</w:t>
-      </w:r>
-      <w:proofErr w:type="gramEnd"/>
-      <w:r>
-        <w:rPr>
-          <w:color w:val="222222"/>
-        </w:rPr>
-        <w:t>% endif %}</w:t>
+        <w:t>If you are filing in person at the court clerk's office, also file a copy of the Proof of Mailing for the Friend of the Court if your court requires FOC copies. Get a copy of the Proof of Mailing for your records.</w:t>
+      </w:r>
+      <w:r>
+        <w:rPr>
+          <w:color w:val="222222"/>
+        </w:rPr>
+        <w:t>{% endif %}</w:t>
       </w:r>
     </w:p>
     <w:p>
@@ -4548,97 +3411,7 @@
           <w:bCs/>
           <w:color w:val="222222"/>
         </w:rPr>
-        <w:t xml:space="preserve">if (not </w:t>
-      </w:r>
-      <w:proofErr w:type="spellStart"/>
-      <w:r>
-        <w:rPr>
-          <w:b/>
-          <w:bCs/>
-          <w:color w:val="222222"/>
-        </w:rPr>
-        <w:t>create_counterclaim</w:t>
-      </w:r>
-      <w:proofErr w:type="spellEnd"/>
-      <w:r>
-        <w:rPr>
-          <w:b/>
-          <w:bCs/>
-          <w:color w:val="222222"/>
-        </w:rPr>
-        <w:t xml:space="preserve"> and </w:t>
-      </w:r>
-      <w:proofErr w:type="spellStart"/>
-      <w:r>
-        <w:rPr>
-          <w:b/>
-          <w:bCs/>
-          <w:color w:val="222222"/>
-        </w:rPr>
-        <w:t>there_are_marital_children</w:t>
-      </w:r>
-      <w:proofErr w:type="spellEnd"/>
-      <w:r>
-        <w:rPr>
-          <w:b/>
-          <w:bCs/>
-          <w:color w:val="222222"/>
-        </w:rPr>
-        <w:t>) or (</w:t>
-      </w:r>
-      <w:proofErr w:type="spellStart"/>
-      <w:r>
-        <w:rPr>
-          <w:b/>
-          <w:bCs/>
-          <w:color w:val="222222"/>
-        </w:rPr>
-        <w:t>create_counterclaim</w:t>
-      </w:r>
-      <w:proofErr w:type="spellEnd"/>
-      <w:r>
-        <w:rPr>
-          <w:b/>
-          <w:bCs/>
-          <w:color w:val="222222"/>
-        </w:rPr>
-        <w:t xml:space="preserve"> and </w:t>
-      </w:r>
-      <w:proofErr w:type="spellStart"/>
-      <w:r>
-        <w:rPr>
-          <w:b/>
-          <w:bCs/>
-          <w:color w:val="222222"/>
-        </w:rPr>
-        <w:t>counterclaim_type</w:t>
-      </w:r>
-      <w:proofErr w:type="spellEnd"/>
-      <w:r>
-        <w:rPr>
-          <w:b/>
-          <w:bCs/>
-          <w:color w:val="222222"/>
-        </w:rPr>
-        <w:t xml:space="preserve"> == “</w:t>
-      </w:r>
-      <w:proofErr w:type="spellStart"/>
-      <w:r>
-        <w:rPr>
-          <w:b/>
-          <w:bCs/>
-          <w:color w:val="222222"/>
-        </w:rPr>
-        <w:t>with_children</w:t>
-      </w:r>
-      <w:proofErr w:type="spellEnd"/>
-      <w:r>
-        <w:rPr>
-          <w:b/>
-          <w:bCs/>
-          <w:color w:val="222222"/>
-        </w:rPr>
-        <w:t>”)</w:t>
+        <w:t>if (not create_counterclaim and there_are_marital_children) or (create_counterclaim and counterclaim_type == “with_children”)</w:t>
       </w:r>
       <w:r>
         <w:rPr>
@@ -4766,7 +3539,7 @@
 </file>
 
 <file path=word/numbering.xml><?xml version="1.0" encoding="utf-8"?>
-<w:numbering xmlns:wpc="http://schemas.microsoft.com/office/word/2010/wordprocessingCanvas" xmlns:cx="http://schemas.microsoft.com/office/drawing/2014/chartex" xmlns:cx1="http://schemas.microsoft.com/office/drawing/2015/9/8/chartex" xmlns:cx2="http://schemas.microsoft.com/office/drawing/2015/10/21/chartex" xmlns:cx3="http://schemas.microsoft.com/office/drawing/2016/5/9/chartex" xmlns:cx4="http://schemas.microsoft.com/office/drawing/2016/5/10/chartex" xmlns:cx5="http://schemas.microsoft.com/office/drawing/2016/5/11/chartex" xmlns:cx6="http://schemas.microsoft.com/office/drawing/2016/5/12/chartex" xmlns:cx7="http://schemas.microsoft.com/office/drawing/2016/5/13/chartex" xmlns:cx8="http://schemas.microsoft.com/office/drawing/2016/5/14/chartex" xmlns:mc="http://schemas.openxmlformats.org/markup-compatibility/2006" xmlns:m="http://schemas.openxmlformats.org/officeDocument/2006/math" xmlns:aink="http://schemas.microsoft.com/office/drawing/2016/ink" xmlns:am3d="http://schemas.microsoft.com/office/drawing/2017/model3d" xmlns:oel="http://schemas.microsoft.com/office/2019/extlst" xmlns:r="http://schemas.openxmlformats.org/officeDocument/2006/relationships" xmlns:wp14="http://schemas.microsoft.com/office/word/2010/wordprocessingDrawing" xmlns:wp="http://schemas.openxmlformats.org/drawingml/2006/wordprocessingDrawing" xmlns:wpg="http://schemas.microsoft.com/office/word/2010/wordprocessingGroup" xmlns:wpi="http://schemas.microsoft.com/office/word/2010/wordprocessingInk" xmlns:wps="http://schemas.microsoft.com/office/word/2010/wordprocessingShape" xmlns:o="urn:schemas-microsoft-com:office:office" xmlns:v="urn:schemas-microsoft-com:vml" xmlns:w10="urn:schemas-microsoft-com:office:word" xmlns:w="http://schemas.openxmlformats.org/wordprocessingml/2006/main" xmlns:w14="http://schemas.microsoft.com/office/word/2010/wordml" xmlns:w15="http://schemas.microsoft.com/office/word/2012/wordml" xmlns:w16cei="http://schemas.microsoft.com/office/word/2026/wordml/cei" xmlns:w16cex="http://schemas.microsoft.com/office/word/2018/wordml/cex" xmlns:w16cid="http://schemas.microsoft.com/office/word/2016/wordml/cid" xmlns:w16="http://schemas.microsoft.com/office/word/2018/wordml" xmlns:w16sdtdh="http://schemas.microsoft.com/office/word/2020/wordml/sdtdatahash" xmlns:w16sdtfl="http://schemas.microsoft.com/office/word/2024/wordml/sdtformatlock" xmlns:w16se="http://schemas.microsoft.com/office/word/2015/wordml/symex" xmlns:w16du="http://schemas.microsoft.com/office/word/2023/wordml/word16du" xmlns:wne="http://schemas.microsoft.com/office/word/2006/wordml" mc:Ignorable="w14 w15 w16se w16cid w16 w16cex w16sdtdh w16sdtfl w16du wp14">
+<w:numbering xmlns:wpc="http://schemas.microsoft.com/office/word/2010/wordprocessingCanvas" xmlns:cx="http://schemas.microsoft.com/office/drawing/2014/chartex" xmlns:cx1="http://schemas.microsoft.com/office/drawing/2015/9/8/chartex" xmlns:cx2="http://schemas.microsoft.com/office/drawing/2015/10/21/chartex" xmlns:cx3="http://schemas.microsoft.com/office/drawing/2016/5/9/chartex" xmlns:cx4="http://schemas.microsoft.com/office/drawing/2016/5/10/chartex" xmlns:cx5="http://schemas.microsoft.com/office/drawing/2016/5/11/chartex" xmlns:cx6="http://schemas.microsoft.com/office/drawing/2016/5/12/chartex" xmlns:cx7="http://schemas.microsoft.com/office/drawing/2016/5/13/chartex" xmlns:cx8="http://schemas.microsoft.com/office/drawing/2016/5/14/chartex" xmlns:mc="http://schemas.openxmlformats.org/markup-compatibility/2006" xmlns:aink="http://schemas.microsoft.com/office/drawing/2016/ink" xmlns:am3d="http://schemas.microsoft.com/office/drawing/2017/model3d" xmlns:o="urn:schemas-microsoft-com:office:office" xmlns:oel="http://schemas.microsoft.com/office/2019/extlst" xmlns:r="http://schemas.openxmlformats.org/officeDocument/2006/relationships" xmlns:m="http://schemas.openxmlformats.org/officeDocument/2006/math" xmlns:v="urn:schemas-microsoft-com:vml" xmlns:wp14="http://schemas.microsoft.com/office/word/2010/wordprocessingDrawing" xmlns:wp="http://schemas.openxmlformats.org/drawingml/2006/wordprocessingDrawing" xmlns:w10="urn:schemas-microsoft-com:office:word" xmlns:w="http://schemas.openxmlformats.org/wordprocessingml/2006/main" xmlns:w14="http://schemas.microsoft.com/office/word/2010/wordml" xmlns:w15="http://schemas.microsoft.com/office/word/2012/wordml" xmlns:w16cex="http://schemas.microsoft.com/office/word/2018/wordml/cex" xmlns:w16cid="http://schemas.microsoft.com/office/word/2016/wordml/cid" xmlns:w16="http://schemas.microsoft.com/office/word/2018/wordml" xmlns:w16du="http://schemas.microsoft.com/office/word/2023/wordml/word16du" xmlns:w16sdtdh="http://schemas.microsoft.com/office/word/2020/wordml/sdtdatahash" xmlns:w16sdtfl="http://schemas.microsoft.com/office/word/2024/wordml/sdtformatlock" xmlns:w16se="http://schemas.microsoft.com/office/word/2015/wordml/symex" xmlns:wpg="http://schemas.microsoft.com/office/word/2010/wordprocessingGroup" xmlns:wpi="http://schemas.microsoft.com/office/word/2010/wordprocessingInk" xmlns:wne="http://schemas.microsoft.com/office/word/2006/wordml" xmlns:wps="http://schemas.microsoft.com/office/word/2010/wordprocessingShape" mc:Ignorable="w14 w15 w16se w16cid w16 w16cex w16sdtdh w16sdtfl w16du wp14">
   <w:abstractNum w:abstractNumId="0" w15:restartNumberingAfterBreak="0">
     <w:nsid w:val="0AFF7FFD"/>
     <w:multiLevelType w:val="multilevel"/>
@@ -7238,7 +6011,7 @@
 </file>
 
 <file path=word/styles.xml><?xml version="1.0" encoding="utf-8"?>
-<w:styles xmlns:mc="http://schemas.openxmlformats.org/markup-compatibility/2006" xmlns:r="http://schemas.openxmlformats.org/officeDocument/2006/relationships" xmlns:w="http://schemas.openxmlformats.org/wordprocessingml/2006/main" xmlns:w14="http://schemas.microsoft.com/office/word/2010/wordml" xmlns:w15="http://schemas.microsoft.com/office/word/2012/wordml" xmlns:w16cex="http://schemas.microsoft.com/office/word/2018/wordml/cex" xmlns:w16cid="http://schemas.microsoft.com/office/word/2016/wordml/cid" xmlns:w16="http://schemas.microsoft.com/office/word/2018/wordml" xmlns:w16sdtdh="http://schemas.microsoft.com/office/word/2020/wordml/sdtdatahash" xmlns:w16sdtfl="http://schemas.microsoft.com/office/word/2024/wordml/sdtformatlock" xmlns:w16se="http://schemas.microsoft.com/office/word/2015/wordml/symex" xmlns:w16du="http://schemas.microsoft.com/office/word/2023/wordml/word16du" mc:Ignorable="w14 w15 w16se w16cid w16 w16cex w16sdtdh w16sdtfl w16du">
+<w:styles xmlns:mc="http://schemas.openxmlformats.org/markup-compatibility/2006" xmlns:r="http://schemas.openxmlformats.org/officeDocument/2006/relationships" xmlns:w="http://schemas.openxmlformats.org/wordprocessingml/2006/main" xmlns:w14="http://schemas.microsoft.com/office/word/2010/wordml" xmlns:w15="http://schemas.microsoft.com/office/word/2012/wordml" xmlns:w16cex="http://schemas.microsoft.com/office/word/2018/wordml/cex" xmlns:w16cid="http://schemas.microsoft.com/office/word/2016/wordml/cid" xmlns:w16="http://schemas.microsoft.com/office/word/2018/wordml" xmlns:w16du="http://schemas.microsoft.com/office/word/2023/wordml/word16du" xmlns:w16sdtdh="http://schemas.microsoft.com/office/word/2020/wordml/sdtdatahash" xmlns:w16sdtfl="http://schemas.microsoft.com/office/word/2024/wordml/sdtformatlock" xmlns:w16se="http://schemas.microsoft.com/office/word/2015/wordml/symex" mc:Ignorable="w14 w15 w16se w16cid w16 w16cex w16sdtdh w16sdtfl w16du">
   <w:docDefaults>
     <w:rPrDefault>
       <w:rPr>

</xml_diff>